<commit_message>
Refactor UI components and improve user experience
</commit_message>
<xml_diff>
--- a/docs/TALK.docx
+++ b/docs/TALK.docx
@@ -25,7 +25,7 @@
     <w:p>
       <w:r>
         <w:rPr/>
-        <w:t xml:space="preserve">Three slides, then the simulator. This is the full version with everything in it: about 7 minutes. Deck: </w:t>
+        <w:t xml:space="preserve">Three slides, then the simulator. About 7 minutes; the cuts for a 4-minute version are listed below. Deck: </w:t>
       </w:r>
       <w:hyperlink r:id="rId11">
         <w:r>
@@ -60,12 +60,12 @@
       <w:tr>
         <w:tc>
           <w:tcPr>
-            <w:tcW w:type="dxa" w:w="6236"/>
+            <w:tcW w:type="dxa" w:w="7370"/>
             <w:shd w:val="clear" w:color="auto" w:fill="EEE8FB"/>
           </w:tcPr>
           <w:p>
             <w:pPr>
-              <w:spacing w:after="60" w:before="60"/>
+              <w:spacing w:before="60" w:after="60"/>
             </w:pPr>
             <w:r>
               <w:rPr>
@@ -77,12 +77,12 @@
         </w:tc>
         <w:tc>
           <w:tcPr>
-            <w:tcW w:type="dxa" w:w="1361"/>
+            <w:tcW w:type="dxa" w:w="1701"/>
             <w:shd w:val="clear" w:color="auto" w:fill="EEE8FB"/>
           </w:tcPr>
           <w:p>
             <w:pPr>
-              <w:spacing w:after="60" w:before="60"/>
+              <w:spacing w:before="60" w:after="60"/>
             </w:pPr>
             <w:r>
               <w:rPr>
@@ -96,29 +96,29 @@
       <w:tr>
         <w:tc>
           <w:tcPr>
-            <w:tcW w:type="dxa" w:w="6236"/>
+            <w:tcW w:type="dxa" w:w="7370"/>
           </w:tcPr>
           <w:p>
             <w:pPr>
-              <w:spacing w:after="60" w:before="60"/>
+              <w:spacing w:before="60" w:after="60"/>
             </w:pPr>
             <w:r>
               <w:rPr/>
-              <w:t>Slide 1: title</w:t>
+              <w:t>Slide 1: the question</w:t>
             </w:r>
           </w:p>
         </w:tc>
         <w:tc>
           <w:tcPr>
-            <w:tcW w:type="dxa" w:w="1361"/>
+            <w:tcW w:type="dxa" w:w="1701"/>
           </w:tcPr>
           <w:p>
             <w:pPr>
-              <w:spacing w:after="60" w:before="60"/>
+              <w:spacing w:before="60" w:after="60"/>
             </w:pPr>
             <w:r>
               <w:rPr/>
-              <w:t>0:10</w:t>
+              <w:t>0:20</w:t>
             </w:r>
           </w:p>
         </w:tc>
@@ -126,11 +126,11 @@
       <w:tr>
         <w:tc>
           <w:tcPr>
-            <w:tcW w:type="dxa" w:w="6236"/>
+            <w:tcW w:type="dxa" w:w="7370"/>
           </w:tcPr>
           <w:p>
             <w:pPr>
-              <w:spacing w:after="60" w:before="60"/>
+              <w:spacing w:before="60" w:after="60"/>
             </w:pPr>
             <w:r>
               <w:rPr/>
@@ -140,15 +140,15 @@
         </w:tc>
         <w:tc>
           <w:tcPr>
-            <w:tcW w:type="dxa" w:w="1361"/>
+            <w:tcW w:type="dxa" w:w="1701"/>
           </w:tcPr>
           <w:p>
             <w:pPr>
-              <w:spacing w:after="60" w:before="60"/>
+              <w:spacing w:before="60" w:after="60"/>
             </w:pPr>
             <w:r>
               <w:rPr/>
-              <w:t>1:25</w:t>
+              <w:t>1:20</w:t>
             </w:r>
           </w:p>
         </w:tc>
@@ -156,29 +156,29 @@
       <w:tr>
         <w:tc>
           <w:tcPr>
-            <w:tcW w:type="dxa" w:w="6236"/>
+            <w:tcW w:type="dxa" w:w="7370"/>
           </w:tcPr>
           <w:p>
             <w:pPr>
-              <w:spacing w:after="60" w:before="60"/>
+              <w:spacing w:before="60" w:after="60"/>
             </w:pPr>
             <w:r>
               <w:rPr/>
-              <w:t>Slide 3: where discrete maths comes in, and why TypeScript</w:t>
+              <w:t>Slide 3: the maths, and why TypeScript</w:t>
             </w:r>
           </w:p>
         </w:tc>
         <w:tc>
           <w:tcPr>
-            <w:tcW w:type="dxa" w:w="1361"/>
+            <w:tcW w:type="dxa" w:w="1701"/>
           </w:tcPr>
           <w:p>
             <w:pPr>
-              <w:spacing w:after="60" w:before="60"/>
+              <w:spacing w:before="60" w:after="60"/>
             </w:pPr>
             <w:r>
               <w:rPr/>
-              <w:t>2:10</w:t>
+              <w:t>2:00</w:t>
             </w:r>
           </w:p>
         </w:tc>
@@ -186,11 +186,11 @@
       <w:tr>
         <w:tc>
           <w:tcPr>
-            <w:tcW w:type="dxa" w:w="6236"/>
+            <w:tcW w:type="dxa" w:w="7370"/>
           </w:tcPr>
           <w:p>
             <w:pPr>
-              <w:spacing w:after="60" w:before="60"/>
+              <w:spacing w:before="60" w:after="60"/>
             </w:pPr>
             <w:r>
               <w:rPr/>
@@ -200,15 +200,15 @@
         </w:tc>
         <w:tc>
           <w:tcPr>
-            <w:tcW w:type="dxa" w:w="1361"/>
+            <w:tcW w:type="dxa" w:w="1701"/>
           </w:tcPr>
           <w:p>
             <w:pPr>
-              <w:spacing w:after="60" w:before="60"/>
+              <w:spacing w:before="60" w:after="60"/>
             </w:pPr>
             <w:r>
               <w:rPr/>
-              <w:t>3:20</w:t>
+              <w:t>2:50</w:t>
             </w:r>
           </w:p>
         </w:tc>
@@ -216,29 +216,29 @@
       <w:tr>
         <w:tc>
           <w:tcPr>
-            <w:tcW w:type="dxa" w:w="6236"/>
+            <w:tcW w:type="dxa" w:w="7370"/>
           </w:tcPr>
           <w:p>
             <w:pPr>
-              <w:spacing w:after="60" w:before="60"/>
+              <w:spacing w:before="60" w:after="60"/>
             </w:pPr>
             <w:r>
               <w:rPr/>
-              <w:t>Closing line</w:t>
+              <w:t>Closing</w:t>
             </w:r>
           </w:p>
         </w:tc>
         <w:tc>
           <w:tcPr>
-            <w:tcW w:type="dxa" w:w="1361"/>
+            <w:tcW w:type="dxa" w:w="1701"/>
           </w:tcPr>
           <w:p>
             <w:pPr>
-              <w:spacing w:after="60" w:before="60"/>
+              <w:spacing w:before="60" w:after="60"/>
             </w:pPr>
             <w:r>
               <w:rPr/>
-              <w:t>0:10</w:t>
+              <w:t>0:15</w:t>
             </w:r>
           </w:p>
         </w:tc>
@@ -248,7 +248,83 @@
     <w:p>
       <w:r>
         <w:rPr/>
-        <w:t>The words below are how you might say it, not lines to memorise. Say them your own way.</w:t>
+        <w:t xml:space="preserve">The whole talk answers one question: </w:t>
+      </w:r>
+      <w:r>
+        <w:rPr>
+          <w:b/>
+        </w:rPr>
+        <w:t>when you are waitlisted, is the train really full?</w:t>
+      </w:r>
+      <w:r>
+        <w:rPr/>
+        <w:t xml:space="preserve"> Every part comes back to it.</w:t>
+      </w:r>
+    </w:p>
+    <w:p>
+      <w:r>
+        <w:rPr/>
+        <w:t>It uses only two colours, and they mean the same thing on the slides and in the app:</w:t>
+      </w:r>
+    </w:p>
+    <w:p>
+      <w:pPr>
+        <w:keepNext/>
+        <w:spacing w:after="40"/>
+      </w:pPr>
+      <w:r>
+        <w:rPr>
+          <w:b/>
+          <w:sz w:val="23"/>
+        </w:rPr>
+        <w:t>Red, "Full here":</w:t>
+      </w:r>
+    </w:p>
+    <w:p>
+      <w:pPr>
+        <w:spacing w:after="240"/>
+      </w:pPr>
+      <w:r>
+        <w:rPr>
+          <w:sz w:val="23"/>
+        </w:rPr>
+        <w:t>the train really was full on part of your journey. Nobody could have seated you.</w:t>
+      </w:r>
+    </w:p>
+    <w:p>
+      <w:pPr>
+        <w:keepNext/>
+        <w:spacing w:after="40"/>
+      </w:pPr>
+      <w:r>
+        <w:rPr>
+          <w:b/>
+          <w:sz w:val="23"/>
+        </w:rPr>
+        <w:t>Amber, "Fragmented":</w:t>
+      </w:r>
+    </w:p>
+    <w:p>
+      <w:pPr>
+        <w:spacing w:after="240"/>
+      </w:pPr>
+      <w:r>
+        <w:rPr>
+          <w:sz w:val="23"/>
+        </w:rPr>
+        <w:t>every part of your journey had a free berth, but no single berth was free all the way. You were turned away only because of how berths had been given out.</w:t>
+      </w:r>
+    </w:p>
+    <w:p>
+      <w:r>
+        <w:rPr/>
+        <w:t>Say these two in your own words early, and keep using exactly these names.</w:t>
+      </w:r>
+    </w:p>
+    <w:p>
+      <w:r>
+        <w:rPr/>
+        <w:t>The words below are how you might say it, not lines to memorise.</w:t>
       </w:r>
     </w:p>
     <w:p>
@@ -256,65 +332,74 @@
         <w:rPr>
           <w:b/>
         </w:rPr>
-        <w:t>To get it down to about 4 minutes,</w:t>
+        <w:t>For a 4-minute version,</w:t>
       </w:r>
       <w:r>
         <w:rPr/>
-        <w:t xml:space="preserve"> make these cuts. Together they save about 2:45.</w:t>
+        <w:t xml:space="preserve"> cut these. Together they save about 2:30, which brings it to about 4:15.</w:t>
       </w:r>
     </w:p>
     <w:p>
       <w:pPr>
-        <w:pStyle w:val="ListBullet"/>
+        <w:ind w:left="340"/>
       </w:pPr>
       <w:r>
         <w:rPr/>
-        <w:t>1. Slide 2: say "what exists" in one sentence, and the solution in two (saves 0:40).</w:t>
+        <w:t>1. Slide 2: say "what exists" in one sentence (saves 0:15).</w:t>
       </w:r>
     </w:p>
     <w:p>
       <w:pPr>
-        <w:pStyle w:val="ListBullet"/>
+        <w:ind w:left="340"/>
       </w:pPr>
       <w:r>
         <w:rPr/>
-        <w:t>2. Slide 3: one sentence for each concept instead of three or four (saves 0:50).</w:t>
+        <w:t>2. Slide 3: one sentence per concept, and skip the transitivity example (saves 0:50).</w:t>
       </w:r>
     </w:p>
     <w:p>
       <w:pPr>
-        <w:pStyle w:val="ListBullet"/>
+        <w:ind w:left="340"/>
       </w:pPr>
       <w:r>
         <w:rPr/>
-        <w:t>3. Slide 3: TypeScript in one sentence, "the same code runs the demo and the experiments" (saves 0:20).</w:t>
+        <w:t>3. Slide 3: skip TypeScript; keep it for questions (saves 0:20).</w:t>
       </w:r>
     </w:p>
     <w:p>
       <w:pPr>
-        <w:pStyle w:val="ListBullet"/>
+        <w:ind w:left="340"/>
       </w:pPr>
       <w:r>
         <w:rPr/>
-        <w:t>4. Demo step 1: skip the tour of the left panel (saves 0:15).</w:t>
+        <w:t>4. Demo step 1: just "rows are berths, columns are stretches" (saves 0:10).</w:t>
       </w:r>
     </w:p>
     <w:p>
       <w:pPr>
-        <w:pStyle w:val="ListBullet"/>
+        <w:ind w:left="340"/>
       </w:pPr>
       <w:r>
         <w:rPr/>
-        <w:t>5. Demo step 5: skip the red rejection (saves 0:20).</w:t>
+        <w:t>5. Demo step 3: skip "Show a seating"; re-chart in step 4 makes the same point (saves 0:15).</w:t>
       </w:r>
     </w:p>
     <w:p>
       <w:pPr>
-        <w:pStyle w:val="ListBullet"/>
+        <w:ind w:left="340"/>
       </w:pPr>
       <w:r>
         <w:rPr/>
-        <w:t>6. Demo step 6: skip Best-fit, Random-fit and the unlimited berths box (saves 0:20).</w:t>
+        <w:t>6. Demo step 5: keep only the first paragraph (saves 0:20).</w:t>
+      </w:r>
+    </w:p>
+    <w:p>
+      <w:pPr>
+        <w:ind w:left="340"/>
+      </w:pPr>
+      <w:r>
+        <w:rPr/>
+        <w:t>7. Slide 1: skip the second sentence (saves 0:10).</w:t>
       </w:r>
     </w:p>
     <w:p>
@@ -353,7 +438,7 @@
       </w:r>
       <w:r>
         <w:rPr/>
-        <w:t>.</w:t>
+        <w:t>. It opens in the simple view, which hides every option the talk doesn't need.</w:t>
       </w:r>
     </w:p>
     <w:p>
@@ -362,7 +447,7 @@
       </w:pPr>
       <w:r>
         <w:rPr/>
-        <w:t>Set the left panel like this:</w:t>
+        <w:t>In the left panel set only two things:</w:t>
       </w:r>
     </w:p>
     <w:p>
@@ -379,54 +464,6 @@
           <w:b/>
         </w:rPr>
         <w:t>Punjab Mail (12137)</w:t>
-      </w:r>
-    </w:p>
-    <w:p>
-      <w:pPr>
-        <w:pStyle w:val="ListBullet2"/>
-        <w:spacing w:after="40"/>
-      </w:pPr>
-      <w:r>
-        <w:rPr/>
-        <w:t xml:space="preserve">Coach: </w:t>
-      </w:r>
-      <w:r>
-        <w:rPr>
-          <w:b/>
-        </w:rPr>
-        <w:t>Sleeper, 72</w:t>
-      </w:r>
-    </w:p>
-    <w:p>
-      <w:pPr>
-        <w:pStyle w:val="ListBullet2"/>
-        <w:spacing w:after="40"/>
-      </w:pPr>
-      <w:r>
-        <w:rPr/>
-        <w:t xml:space="preserve">RAC berths: </w:t>
-      </w:r>
-      <w:r>
-        <w:rPr>
-          <w:b/>
-        </w:rPr>
-        <w:t>None</w:t>
-      </w:r>
-    </w:p>
-    <w:p>
-      <w:pPr>
-        <w:pStyle w:val="ListBullet2"/>
-        <w:spacing w:after="40"/>
-      </w:pPr>
-      <w:r>
-        <w:rPr/>
-        <w:t xml:space="preserve">Trip lengths: </w:t>
-      </w:r>
-      <w:r>
-        <w:rPr>
-          <w:b/>
-        </w:rPr>
-        <w:t>Mixed short and long trips</w:t>
       </w:r>
     </w:p>
     <w:p>
@@ -450,97 +487,58 @@
       </w:r>
     </w:p>
     <w:p>
-      <w:pPr>
-        <w:pStyle w:val="ListBullet2"/>
-        <w:spacing w:after="40"/>
-      </w:pPr>
       <w:r>
         <w:rPr/>
-        <w:t>Tatkal surge: off</w:t>
+        <w:t xml:space="preserve">   Leave First-fit selected.</w:t>
       </w:r>
     </w:p>
     <w:p>
       <w:pPr>
-        <w:pStyle w:val="ListBullet2"/>
-        <w:spacing w:after="40"/>
+        <w:pStyle w:val="ListNumber"/>
       </w:pPr>
       <w:r>
         <w:rPr/>
-        <w:t xml:space="preserve">Seed: </w:t>
+        <w:t xml:space="preserve">The strip under the train name must show COACH: Sleeper (72B), SEED: #1 and STREAM: </w:t>
       </w:r>
       <w:r>
         <w:rPr>
           <w:b/>
         </w:rPr>
-        <w:t>1</w:t>
+        <w:t>361 Requests</w:t>
       </w:r>
-    </w:p>
-    <w:p>
-      <w:pPr>
-        <w:pStyle w:val="ListBullet2"/>
-        <w:spacing w:after="40"/>
-      </w:pPr>
       <w:r>
         <w:rPr/>
-        <w:t xml:space="preserve">Strategy: </w:t>
+        <w:t xml:space="preserve">. If it does, every number below will match. (On a laptop screen narrower than a desktop, the coach can start as Mini, 16: click </w:t>
       </w:r>
       <w:r>
         <w:rPr>
           <w:b/>
         </w:rPr>
-        <w:t>First-fit</w:t>
+        <w:t>Show all options</w:t>
       </w:r>
       <w:r>
         <w:rPr/>
-        <w:t>, and "Compare with another strategy" unticked</w:t>
-      </w:r>
-    </w:p>
-    <w:p>
-      <w:pPr>
-        <w:pStyle w:val="ListNumber"/>
-      </w:pPr>
-      <w:r>
-        <w:rPr/>
-        <w:t xml:space="preserve">The line under the title must end with Seed 1 and </w:t>
+        <w:t xml:space="preserve">, pick </w:t>
       </w:r>
       <w:r>
         <w:rPr>
           <w:b/>
         </w:rPr>
-        <w:t>361 requests</w:t>
+        <w:t>Sleeper, 72</w:t>
       </w:r>
       <w:r>
         <w:rPr/>
-        <w:t>. If it does, every number below will match.</w:t>
-      </w:r>
-    </w:p>
-    <w:p>
-      <w:pPr>
-        <w:pStyle w:val="ListNumber"/>
-      </w:pPr>
-      <w:r>
-        <w:rPr/>
-        <w:t xml:space="preserve">Drag </w:t>
+        <w:t xml:space="preserve">, then </w:t>
       </w:r>
       <w:r>
         <w:rPr>
           <w:b/>
         </w:rPr>
-        <w:t>Speed</w:t>
+        <w:t>Simple view</w:t>
       </w:r>
       <w:r>
         <w:rPr/>
-        <w:t xml:space="preserve"> to about 40/s, then press </w:t>
-      </w:r>
-      <w:r>
-        <w:rPr>
-          <w:b/>
-        </w:rPr>
-        <w:t>Reset</w:t>
-      </w:r>
-      <w:r>
-        <w:rPr/>
-        <w:t xml:space="preserve"> so it says "Request 0 of 361".</w:t>
+        <w:t>.)</w:t>
       </w:r>
     </w:p>
     <w:p>
@@ -575,14 +573,14 @@
         <w:pStyle w:val="Heading2"/>
       </w:pPr>
       <w:r>
-        <w:t>Slide 1: Title</w:t>
+        <w:t>Slide 1: The question</w:t>
       </w:r>
       <w:r>
         <w:rPr>
           <w:b w:val="0"/>
           <w:color w:val="5B35C8"/>
         </w:rPr>
-        <w:t xml:space="preserve">   0:10</w:t>
+        <w:t xml:space="preserve">   0:20</w:t>
       </w:r>
     </w:p>
     <w:p>
@@ -598,22 +596,38 @@
           <w:rFonts w:ascii="Georgia" w:hAnsi="Georgia"/>
           <w:sz w:val="26"/>
         </w:rPr>
-        <w:t>Hi everyone, I'm Neel. My project is called "The Train Isn't Full", and it's about railway waiting lists.</w:t>
+        <w:t>Hi everyone, I'm Neel. Most of us have been on a train waiting list, and then walked through that same train and seen empty berths.</w:t>
       </w:r>
     </w:p>
     <w:p>
       <w:pPr>
+        <w:pBdr>
+          <w:left w:val="single" w:sz="18" w:space="10" w:color="5B35C8"/>
+        </w:pBdr>
+        <w:spacing w:after="180" w:line="324" w:lineRule="auto"/>
+        <w:ind w:left="283"/>
+      </w:pPr>
+      <w:r>
+        <w:rPr>
+          <w:rFonts w:ascii="Georgia" w:hAnsi="Georgia"/>
+          <w:sz w:val="26"/>
+        </w:rPr>
+        <w:t>So my project asks one question: when you're waitlisted, is the train really full? I'll show you the problem, the maths behind it, and then the app I built to answer it.</w:t>
+      </w:r>
+    </w:p>
+    <w:p>
+      <w:pPr>
         <w:pStyle w:val="Heading2"/>
       </w:pPr>
       <w:r>
-        <w:t>Slide 2: The problem and our solution</w:t>
+        <w:t>Slide 2: The problem, and our solution</w:t>
       </w:r>
       <w:r>
         <w:rPr>
           <w:b w:val="0"/>
           <w:color w:val="5B35C8"/>
         </w:rPr>
-        <w:t xml:space="preserve">   1:25</w:t>
+        <w:t xml:space="preserve">   1:20</w:t>
       </w:r>
     </w:p>
     <w:p>
@@ -622,7 +636,7 @@
           <w:i/>
           <w:color w:val="4D4459"/>
         </w:rPr>
-        <w:t>The problem. Point at the small chart on the left.</w:t>
+        <w:t>Point at the small chart on the left.</w:t>
       </w:r>
     </w:p>
     <w:p>
@@ -638,7 +652,7 @@
           <w:rFonts w:ascii="Georgia" w:hAnsi="Georgia"/>
           <w:sz w:val="26"/>
         </w:rPr>
-        <w:t>So here's the problem. Take two berths on a train from Mumbai to Delhi. Berth 1 is free till Surat. Berth 2 is free from Surat onwards.</w:t>
+        <w:t>Here's the smallest example. Two berths, Mumbai to Delhi, through Surat. Berth 1 is free till Surat, and berth 2 is free after Surat.</w:t>
       </w:r>
     </w:p>
     <w:p>
@@ -654,7 +668,7 @@
           <w:rFonts w:ascii="Georgia" w:hAnsi="Georgia"/>
           <w:sz w:val="26"/>
         </w:rPr>
-        <w:t>Now someone wants to go the whole way. There's an empty berth on both halves of the trip, but they still get waitlisted, because no single berth is free from start to end.</w:t>
+        <w:t>Someone wants to go all the way. There's a free berth on both halves of the trip, but they're still waitlisted, because no single berth is free from start to end, and you can't change berths halfway.</w:t>
       </w:r>
     </w:p>
     <w:p>
@@ -670,7 +684,7 @@
           <w:rFonts w:ascii="Georgia" w:hAnsi="Georgia"/>
           <w:sz w:val="26"/>
         </w:rPr>
-        <w:t>So the train isn't really full. The berths were just given out in a bad order.</w:t>
+        <w:t>So there are two reasons you can be waitlisted. Either some part of your journey is genuinely full: I'll show that in red and call it "full here". Or there was room everywhere, just in the wrong places, because of how earlier berths were given out: that's amber, "fragmented".</w:t>
       </w:r>
     </w:p>
     <w:p>
@@ -679,7 +693,7 @@
           <w:i/>
           <w:color w:val="4D4459"/>
         </w:rPr>
-        <w:t>What exists. Point at the strip at the bottom.</w:t>
+        <w:t>Point at the strip at the bottom.</w:t>
       </w:r>
     </w:p>
     <w:p>
@@ -695,23 +709,7 @@
           <w:rFonts w:ascii="Georgia" w:hAnsi="Georgia"/>
           <w:sz w:val="26"/>
         </w:rPr>
-        <w:t>I looked at what already exists. Apps like ConfirmTkt predict whether a waitlisted ticket will get confirmed, and suggest other trains. The Railways have their own AI system, called Ideal Train Profile, which adjusts how seats are split between stations. And in research there's a paper called "The Seat Reservation Problem", which studies the worst case in theory.</w:t>
-      </w:r>
-    </w:p>
-    <w:p>
-      <w:pPr>
-        <w:pBdr>
-          <w:left w:val="single" w:sz="18" w:space="10" w:color="5B35C8"/>
-        </w:pBdr>
-        <w:spacing w:after="180" w:line="324" w:lineRule="auto"/>
-        <w:ind w:left="283"/>
-      </w:pPr>
-      <w:r>
-        <w:rPr>
-          <w:rFonts w:ascii="Georgia" w:hAnsi="Georgia"/>
-          <w:sz w:val="26"/>
-        </w:rPr>
-        <w:t>But none of these tells a passenger why they were waitlisted, or whether the train was actually full.</w:t>
+        <w:t>Apps like ConfirmTkt predict whether your waitlist will confirm. The Railways' own AI, Ideal Train Profile, adjusts quotas between stations. And a research paper, "The Seat Reservation Problem", studies the worst case in theory. None of them tells a passenger which of the two reasons it was.</w:t>
       </w:r>
     </w:p>
     <w:p>
@@ -720,7 +718,7 @@
           <w:i/>
           <w:color w:val="4D4459"/>
         </w:rPr>
-        <w:t>Our solution. Point at the list on the right.</w:t>
+        <w:t>Point at the list on the right.</w:t>
       </w:r>
     </w:p>
     <w:p>
@@ -736,23 +734,7 @@
           <w:rFonts w:ascii="Georgia" w:hAnsi="Georgia"/>
           <w:sz w:val="26"/>
         </w:rPr>
-        <w:t>That's the gap I worked on. I built a web app that replays the bookings of a real train, one by one.</w:t>
-      </w:r>
-    </w:p>
-    <w:p>
-      <w:pPr>
-        <w:pBdr>
-          <w:left w:val="single" w:sz="18" w:space="10" w:color="5B35C8"/>
-        </w:pBdr>
-        <w:spacing w:after="180" w:line="324" w:lineRule="auto"/>
-        <w:ind w:left="283"/>
-      </w:pPr>
-      <w:r>
-        <w:rPr>
-          <w:rFonts w:ascii="Georgia" w:hAnsi="Georgia"/>
-          <w:sz w:val="26"/>
-        </w:rPr>
-        <w:t>For every waitlisted passenger it gives a proof: either the train really was full, or it was only the way berths were given out. You can compare five ways of giving out berths on exactly the same passengers. It handles RAC as well. And every run is repeatable, because the same seed always gives the same passengers.</w:t>
+        <w:t>So I built a simulator that replays a real train's bookings, and for every waitlisted passenger proves whether it was red or amber. Then it re-charts the coach to seat as many waitlisted people as possible, and it compares five ways of giving out berths on exactly the same passengers.</w:t>
       </w:r>
     </w:p>
     <w:p>
@@ -767,103 +749,7 @@
           <w:b w:val="0"/>
           <w:color w:val="5B35C8"/>
         </w:rPr>
-        <w:t xml:space="preserve">   2:10</w:t>
-      </w:r>
-    </w:p>
-    <w:p>
-      <w:pPr>
-        <w:pBdr>
-          <w:left w:val="single" w:sz="18" w:space="10" w:color="5B35C8"/>
-        </w:pBdr>
-        <w:spacing w:after="180" w:line="324" w:lineRule="auto"/>
-        <w:ind w:left="283"/>
-      </w:pPr>
-      <w:r>
-        <w:rPr>
-          <w:rFonts w:ascii="Georgia" w:hAnsi="Georgia"/>
-          <w:sz w:val="26"/>
-        </w:rPr>
-        <w:t>Now, where is discrete maths in this? Pretty much everywhere.</w:t>
-      </w:r>
-    </w:p>
-    <w:p>
-      <w:pPr>
-        <w:pBdr>
-          <w:left w:val="single" w:sz="18" w:space="10" w:color="5B35C8"/>
-        </w:pBdr>
-        <w:spacing w:after="180" w:line="324" w:lineRule="auto"/>
-        <w:ind w:left="283"/>
-      </w:pPr>
-      <w:r>
-        <w:rPr>
-          <w:rFonts w:ascii="Georgia" w:hAnsi="Georgia"/>
-          <w:sz w:val="26"/>
-        </w:rPr>
-        <w:t>First, relations. A booking is an interval on the route, from where you board up to where you get off. Two bookings are related if they overlap. That relation is reflexive and symmetric, but not transitive. The app uses it every single time it checks whether a berth is free.</w:t>
-      </w:r>
-    </w:p>
-    <w:p>
-      <w:pPr>
-        <w:pBdr>
-          <w:left w:val="single" w:sz="18" w:space="10" w:color="5B35C8"/>
-        </w:pBdr>
-        <w:spacing w:after="180" w:line="324" w:lineRule="auto"/>
-        <w:ind w:left="283"/>
-      </w:pPr>
-      <w:r>
-        <w:rPr>
-          <w:rFonts w:ascii="Georgia" w:hAnsi="Georgia"/>
-          <w:sz w:val="26"/>
-        </w:rPr>
-        <w:t>Second, partial orders. If one passenger gets off before another one boards, the first comes before the second. That's a partial order. The passengers on one berth form a chain. Passengers who all overlap form an antichain, and they all need different berths. By Dilworth's theorem, the fewest berths you need is the size of the biggest antichain, which is just the busiest stretch of the route.</w:t>
-      </w:r>
-    </w:p>
-    <w:p>
-      <w:pPr>
-        <w:pBdr>
-          <w:left w:val="single" w:sz="18" w:space="10" w:color="5B35C8"/>
-        </w:pBdr>
-        <w:spacing w:after="180" w:line="324" w:lineRule="auto"/>
-        <w:ind w:left="283"/>
-      </w:pPr>
-      <w:r>
-        <w:rPr>
-          <w:rFonts w:ascii="Georgia" w:hAnsi="Georgia"/>
-          <w:sz w:val="26"/>
-        </w:rPr>
-        <w:t>Third, functions and pigeonhole. A seating is a function from bookings to berths. If a stretch already has 72 people on 72 berths, pigeonhole says one more can't fit. That's exactly how the app proves that a train was full.</w:t>
-      </w:r>
-    </w:p>
-    <w:p>
-      <w:pPr>
-        <w:pBdr>
-          <w:left w:val="single" w:sz="18" w:space="10" w:color="5B35C8"/>
-        </w:pBdr>
-        <w:spacing w:after="180" w:line="324" w:lineRule="auto"/>
-        <w:ind w:left="283"/>
-      </w:pPr>
-      <w:r>
-        <w:rPr>
-          <w:rFonts w:ascii="Georgia" w:hAnsi="Georgia"/>
-          <w:sz w:val="26"/>
-        </w:rPr>
-        <w:t>Fourth, graphs. Make every booking a vertex and join two if they overlap. That's an interval graph, and giving out berths is colouring it. First-fit is simply greedy colouring.</w:t>
-      </w:r>
-    </w:p>
-    <w:p>
-      <w:pPr>
-        <w:pBdr>
-          <w:left w:val="single" w:sz="18" w:space="10" w:color="5B35C8"/>
-        </w:pBdr>
-        <w:spacing w:after="180" w:line="324" w:lineRule="auto"/>
-        <w:ind w:left="283"/>
-      </w:pPr>
-      <w:r>
-        <w:rPr>
-          <w:rFonts w:ascii="Georgia" w:hAnsi="Georgia"/>
-          <w:sz w:val="26"/>
-        </w:rPr>
-        <w:t>The line at the bottom ties it together. The bookings fit in k berths exactly when no stretch of the route has more than k people on it.</w:t>
+        <w:t xml:space="preserve">   2:00</w:t>
       </w:r>
     </w:p>
     <w:p>
@@ -872,7 +758,7 @@
           <w:i/>
           <w:color w:val="4D4459"/>
         </w:rPr>
-        <w:t>Why TypeScript. No slide for this; say it before you switch.</w:t>
+        <w:t>Point at the line under the title.</w:t>
       </w:r>
     </w:p>
     <w:p>
@@ -888,7 +774,16 @@
           <w:rFonts w:ascii="Georgia" w:hAnsi="Georgia"/>
           <w:sz w:val="26"/>
         </w:rPr>
-        <w:t>One word on the language. Everything is written in TypeScript, and I wrote all the algorithms myself, with no graph libraries.</w:t>
+        <w:t>Everything starts from one modelling choice. A booking is an interval on the route, from where you board up to where you get off. If I get off at Surat and you board at Surat, our intervals only touch, so we can share a berth.</w:t>
+      </w:r>
+    </w:p>
+    <w:p>
+      <w:r>
+        <w:rPr>
+          <w:i/>
+          <w:color w:val="4D4459"/>
+        </w:rPr>
+        <w:t>Point at each card in turn.</w:t>
       </w:r>
     </w:p>
     <w:p>
@@ -904,7 +799,105 @@
           <w:rFonts w:ascii="Georgia" w:hAnsi="Georgia"/>
           <w:sz w:val="26"/>
         </w:rPr>
-        <w:t>I picked TypeScript for three reasons. The same code runs in the browser and on my laptop, so the engine in this demo is the exact one I ran my experiments with, not a second copy. The strict type checking catches silly mistakes, like mixing up a booking number with a berth number. And it needs no server, so the app works offline.</w:t>
+        <w:t>Relations: two bookings are related if they overlap. It's reflexive and symmetric, but not transitive. Mumbai to Surat overlaps Mumbai to Delhi, which overlaps Surat to Delhi, but Mumbai to Surat and Surat to Delhi only touch. The app checks this relation every time it looks for a free berth.</w:t>
+      </w:r>
+    </w:p>
+    <w:p>
+      <w:pPr>
+        <w:pBdr>
+          <w:left w:val="single" w:sz="18" w:space="10" w:color="5B35C8"/>
+        </w:pBdr>
+        <w:spacing w:after="180" w:line="324" w:lineRule="auto"/>
+        <w:ind w:left="283"/>
+      </w:pPr>
+      <w:r>
+        <w:rPr>
+          <w:rFonts w:ascii="Georgia" w:hAnsi="Georgia"/>
+          <w:sz w:val="26"/>
+        </w:rPr>
+        <w:t>Partial orders: one booking comes before another if it ends before the other starts. The passengers on one berth form a chain. Passengers who all overlap form an antichain, so each needs a different berth.</w:t>
+      </w:r>
+    </w:p>
+    <w:p>
+      <w:pPr>
+        <w:pBdr>
+          <w:left w:val="single" w:sz="18" w:space="10" w:color="5B35C8"/>
+        </w:pBdr>
+        <w:spacing w:after="180" w:line="324" w:lineRule="auto"/>
+        <w:ind w:left="283"/>
+      </w:pPr>
+      <w:r>
+        <w:rPr>
+          <w:rFonts w:ascii="Georgia" w:hAnsi="Georgia"/>
+          <w:sz w:val="26"/>
+        </w:rPr>
+        <w:t>Functions and pigeonhole: a seating is a function from bookings to berths. If one stretch already has 72 people on 72 berths, a 73rd can't fit. That's the proof behind every red rejection.</w:t>
+      </w:r>
+    </w:p>
+    <w:p>
+      <w:pPr>
+        <w:pBdr>
+          <w:left w:val="single" w:sz="18" w:space="10" w:color="5B35C8"/>
+        </w:pBdr>
+        <w:spacing w:after="180" w:line="324" w:lineRule="auto"/>
+        <w:ind w:left="283"/>
+      </w:pPr>
+      <w:r>
+        <w:rPr>
+          <w:rFonts w:ascii="Georgia" w:hAnsi="Georgia"/>
+          <w:sz w:val="26"/>
+        </w:rPr>
+        <w:t>Graph colouring: make each booking a vertex and join two that overlap. Giving out berths is colouring this graph, and each strategy is a different colouring rule.</w:t>
+      </w:r>
+    </w:p>
+    <w:p>
+      <w:r>
+        <w:rPr>
+          <w:i/>
+          <w:color w:val="4D4459"/>
+        </w:rPr>
+        <w:t>Point at the dark box.</w:t>
+      </w:r>
+    </w:p>
+    <w:p>
+      <w:pPr>
+        <w:pBdr>
+          <w:left w:val="single" w:sz="18" w:space="10" w:color="5B35C8"/>
+        </w:pBdr>
+        <w:spacing w:after="180" w:line="324" w:lineRule="auto"/>
+        <w:ind w:left="283"/>
+      </w:pPr>
+      <w:r>
+        <w:rPr>
+          <w:rFonts w:ascii="Georgia" w:hAnsi="Georgia"/>
+          <w:sz w:val="26"/>
+        </w:rPr>
+        <w:t>This theorem ties it together. The bookings fit in k berths exactly when no stretch has more than k people on it. One direction is pigeonhole. For the other, seat people in boarding order on the lowest free berth, and it never gets stuck. That's how the app proves an amber rejection: it builds a seating that fits everyone.</w:t>
+      </w:r>
+    </w:p>
+    <w:p>
+      <w:r>
+        <w:rPr>
+          <w:i/>
+          <w:color w:val="4D4459"/>
+        </w:rPr>
+        <w:t>No slide for this; say it before you switch.</w:t>
+      </w:r>
+    </w:p>
+    <w:p>
+      <w:pPr>
+        <w:pBdr>
+          <w:left w:val="single" w:sz="18" w:space="10" w:color="5B35C8"/>
+        </w:pBdr>
+        <w:spacing w:after="180" w:line="324" w:lineRule="auto"/>
+        <w:ind w:left="283"/>
+      </w:pPr>
+      <w:r>
+        <w:rPr>
+          <w:rFonts w:ascii="Georgia" w:hAnsi="Georgia"/>
+          <w:sz w:val="26"/>
+        </w:rPr>
+        <w:t>I wrote it all in TypeScript, every algorithm from scratch. Mainly because the same code runs in the browser and on my laptop, so this demo uses the exact engine my experiments used. And strict types catch mistakes like mixing up a booking number with a berth number.</w:t>
       </w:r>
     </w:p>
     <w:p>
@@ -938,7 +931,7 @@
         <w:pageBreakBefore/>
       </w:pPr>
       <w:r>
-        <w:t>The demo</w:t>
+        <w:t>The demo (2:50)</w:t>
       </w:r>
     </w:p>
     <w:p>
@@ -946,14 +939,14 @@
         <w:pStyle w:val="Heading2"/>
       </w:pPr>
       <w:r>
-        <w:t>1. What you're looking at</w:t>
+        <w:t>1. Read the chart</w:t>
       </w:r>
       <w:r>
         <w:rPr>
           <w:b w:val="0"/>
           <w:color w:val="5B35C8"/>
         </w:rPr>
-        <w:t xml:space="preserve">   0:30</w:t>
+        <w:t xml:space="preserve">   0:20</w:t>
       </w:r>
     </w:p>
     <w:p>
@@ -974,7 +967,7 @@
         <w:rPr>
           <w:sz w:val="22"/>
         </w:rPr>
-        <w:t>Nothing yet. Point at the left panel, then the chart, then the right side.</w:t>
+        <w:t>Nothing yet. Point at the chart, then the left panel.</w:t>
       </w:r>
     </w:p>
     <w:p>
@@ -990,7 +983,7 @@
           <w:rFonts w:ascii="Georgia" w:hAnsi="Georgia"/>
           <w:sz w:val="26"/>
         </w:rPr>
-        <w:t>This is the simulator. On the left is the setup. You pick a train, and there are three real ones here with their actual stops. You pick the coach, how many RAC berths, how busy the day is, and the rule for giving out berths.</w:t>
+        <w:t>This is one sleeper coach of the Punjab Mail, Mumbai to Firozpur, 54 stops. Each row is a berth, 72 of them. Each column is the stretch between two stations. A green bar will be one passenger's trip.</w:t>
       </w:r>
     </w:p>
     <w:p>
@@ -1006,23 +999,7 @@
           <w:rFonts w:ascii="Georgia" w:hAnsi="Georgia"/>
           <w:sz w:val="26"/>
         </w:rPr>
-        <w:t>In the middle is the reservation chart. This is one sleeper coach of the Punjab Mail, Mumbai to Firozpur. The 72 berths go down the side and the stations go across the top.</w:t>
-      </w:r>
-    </w:p>
-    <w:p>
-      <w:pPr>
-        <w:pBdr>
-          <w:left w:val="single" w:sz="18" w:space="10" w:color="5B35C8"/>
-        </w:pBdr>
-        <w:spacing w:after="180" w:line="324" w:lineRule="auto"/>
-        <w:ind w:left="283"/>
-      </w:pPr>
-      <w:r>
-        <w:rPr>
-          <w:rFonts w:ascii="Georgia" w:hAnsi="Georgia"/>
-          <w:sz w:val="26"/>
-        </w:rPr>
-        <w:t>I've generated 361 booking requests for it. That's more than it can hold, so think of it as a busy day.</w:t>
+        <w:t>On the left I've set up a busy day: 361 booking requests, about 1.4 times what this coach can hold.</w:t>
       </w:r>
     </w:p>
     <w:p>
@@ -1065,13 +1042,13 @@
           <w:b/>
           <w:sz w:val="22"/>
         </w:rPr>
-        <w:t>Play</w:t>
+        <w:t>Dispatch</w:t>
       </w:r>
       <w:r>
         <w:rPr>
           <w:sz w:val="22"/>
         </w:rPr>
-        <w:t>. Click the button, not the space bar. It takes about 9 seconds.</w:t>
+        <w:t>. Click it with the mouse, not the space bar. It takes about 10 to 15 seconds.</w:t>
       </w:r>
     </w:p>
     <w:p>
@@ -1087,7 +1064,7 @@
           <w:rFonts w:ascii="Georgia" w:hAnsi="Georgia"/>
           <w:sz w:val="26"/>
         </w:rPr>
-        <w:t>I'll press play. Every green bar is one passenger. The rule here is First-fit, the greedy colouring from the slide: each passenger gets the lowest-numbered berth that's free.</w:t>
+        <w:t>I'll start the bookings. The rule here is First-fit, the simplest colouring: each passenger gets the lowest-numbered berth that is free for their trip.</w:t>
       </w:r>
     </w:p>
     <w:p>
@@ -1112,7 +1089,7 @@
           <w:rFonts w:ascii="Georgia" w:hAnsi="Georgia"/>
           <w:sz w:val="26"/>
         </w:rPr>
-        <w:t>Okay, done. 271 people got a berth and 90 got waitlisted.</w:t>
+        <w:t>271 people got a berth, and 90 were waitlisted.</w:t>
       </w:r>
     </w:p>
     <w:p>
@@ -1128,7 +1105,7 @@
           <w:rFonts w:ascii="Georgia" w:hAnsi="Georgia"/>
           <w:sz w:val="26"/>
         </w:rPr>
-        <w:t>But look at these two. "Full here" is zero, and "Assignment" is 90. So not one of those 90 was turned away because the train was full.</w:t>
+        <w:t>Now the important part. "Full here", the red one, is zero. "Fragmented", the amber one, is 90. So not one of those 90 people was turned away because the train was full.</w:t>
       </w:r>
     </w:p>
     <w:p>
@@ -1143,7 +1120,7 @@
           <w:b w:val="0"/>
           <w:color w:val="5B35C8"/>
         </w:rPr>
-        <w:t xml:space="preserve">   0:40</w:t>
+        <w:t xml:space="preserve">   0:30</w:t>
       </w:r>
     </w:p>
     <w:p>
@@ -1164,7 +1141,7 @@
         <w:rPr>
           <w:sz w:val="22"/>
         </w:rPr>
-        <w:t xml:space="preserve">In the </w:t>
+        <w:t xml:space="preserve">In </w:t>
       </w:r>
       <w:r>
         <w:rPr>
@@ -1177,14 +1154,14 @@
         <w:rPr>
           <w:sz w:val="22"/>
         </w:rPr>
-        <w:t xml:space="preserve"> box on the right, click </w:t>
+        <w:t xml:space="preserve"> on the right, click </w:t>
       </w:r>
       <w:r>
         <w:rPr>
           <w:b/>
           <w:sz w:val="22"/>
         </w:rPr>
-        <w:t>207</w:t>
+        <w:t>#207</w:t>
       </w:r>
       <w:r>
         <w:rPr>
@@ -1206,23 +1183,7 @@
           <w:rFonts w:ascii="Georgia" w:hAnsi="Georgia"/>
           <w:sz w:val="26"/>
         </w:rPr>
-        <w:t>Let me pick one of them. This is passenger 207, going from Mumbai to Lalitpur.</w:t>
-      </w:r>
-    </w:p>
-    <w:p>
-      <w:pPr>
-        <w:pBdr>
-          <w:left w:val="single" w:sz="18" w:space="10" w:color="5B35C8"/>
-        </w:pBdr>
-        <w:spacing w:after="180" w:line="324" w:lineRule="auto"/>
-        <w:ind w:left="283"/>
-      </w:pPr>
-      <w:r>
-        <w:rPr>
-          <w:rFonts w:ascii="Georgia" w:hAnsi="Georgia"/>
-          <w:sz w:val="26"/>
-        </w:rPr>
-        <w:t>The app says every stretch of that trip still had a free berth. Even on the busiest stretch only 69 out of 72 were taken. It just was never the same berth all the way.</w:t>
+        <w:t>Let's take one of them, passenger 207, Mumbai to Lalitpur. The app says every stretch of that trip still had a free berth. Even the busiest stretch had only 69 of 72 taken.</w:t>
       </w:r>
     </w:p>
     <w:p>
@@ -1272,31 +1233,15 @@
           <w:rFonts w:ascii="Georgia" w:hAnsi="Georgia"/>
           <w:sz w:val="26"/>
         </w:rPr>
-        <w:t>And if I click this, it shows a seating where everybody fits, this passenger too. That amber bar is them.</w:t>
+        <w:t>And here's the proof. This is an actual seating where everyone booked so far fits, including passenger 207, that amber bar. That's the theorem from the slide, built for this one passenger.</w:t>
       </w:r>
     </w:p>
     <w:p>
       <w:pPr>
-        <w:pBdr>
-          <w:left w:val="single" w:sz="18" w:space="10" w:color="5B35C8"/>
-        </w:pBdr>
-        <w:spacing w:after="180" w:line="324" w:lineRule="auto"/>
-        <w:ind w:left="283"/>
+        <w:pStyle w:val="Heading2"/>
       </w:pPr>
       <w:r>
-        <w:rPr>
-          <w:rFonts w:ascii="Georgia" w:hAnsi="Georgia"/>
-          <w:sz w:val="26"/>
-        </w:rPr>
-        <w:t>So that result from the slide isn't just theory. The app uses it for every single rejection.</w:t>
-      </w:r>
-    </w:p>
-    <w:p>
-      <w:pPr>
-        <w:pStyle w:val="Heading2"/>
-      </w:pPr>
-      <w:r>
-        <w:t>4. Decide berths later</w:t>
+        <w:t>4. Re-chart the waitlist</w:t>
       </w:r>
       <w:r>
         <w:rPr>
@@ -1324,40 +1269,14 @@
         <w:rPr>
           <w:sz w:val="22"/>
         </w:rPr>
-        <w:t xml:space="preserve">Scroll back to the top. Under Strategy, click </w:t>
+        <w:t xml:space="preserve">Scroll back to the top of the chart and click </w:t>
       </w:r>
       <w:r>
         <w:rPr>
           <w:b/>
           <w:sz w:val="22"/>
         </w:rPr>
-        <w:t>Deferred</w:t>
-      </w:r>
-      <w:r>
-        <w:rPr>
-          <w:sz w:val="22"/>
-        </w:rPr>
-        <w:t xml:space="preserve">. Click </w:t>
-      </w:r>
-      <w:r>
-        <w:rPr>
-          <w:b/>
-          <w:sz w:val="22"/>
-        </w:rPr>
-        <w:t>Jump to end</w:t>
-      </w:r>
-      <w:r>
-        <w:rPr>
-          <w:sz w:val="22"/>
-        </w:rPr>
-        <w:t xml:space="preserve">. Then click </w:t>
-      </w:r>
-      <w:r>
-        <w:rPr>
-          <w:b/>
-          <w:sz w:val="22"/>
-        </w:rPr>
-        <w:t>Prepare chart</w:t>
+        <w:t>Re-chart waitlist</w:t>
       </w:r>
       <w:r>
         <w:rPr>
@@ -1379,7 +1298,7 @@
           <w:rFonts w:ascii="Georgia" w:hAnsi="Georgia"/>
           <w:sz w:val="26"/>
         </w:rPr>
-        <w:t>Now, what if we don't give berth numbers at booking time, and only decide them at charting? That's this option, Deferred. Same 361 requests.</w:t>
+        <w:t>Proving it one passenger at a time doesn't help anyone travel. So once booking closes, the app re-charts the coach. Everyone who has a berth keeps one, though some move, and it fits in as many waitlisted people as possible.</w:t>
       </w:r>
     </w:p>
     <w:p>
@@ -1395,201 +1314,22 @@
           <w:rFonts w:ascii="Georgia" w:hAnsi="Georgia"/>
           <w:sz w:val="26"/>
         </w:rPr>
-        <w:t>Assignment is zero now. And when I prepare the chart, it seats everybody in boarding order, and they all fit.</w:t>
+        <w:t>Six of the 90 get a berth: the amber bars, and the green ticks in the waitlist. Passenger 207 is one of them. So 271 becomes 277, and six is provably the most you can add without cancelling anyone's ticket.</w:t>
       </w:r>
     </w:p>
     <w:p>
       <w:pPr>
-        <w:pBdr>
-          <w:left w:val="single" w:sz="18" w:space="10" w:color="5B35C8"/>
-        </w:pBdr>
-        <w:spacing w:after="180" w:line="324" w:lineRule="auto"/>
-        <w:ind w:left="283"/>
+        <w:pStyle w:val="Heading2"/>
       </w:pPr>
       <w:r>
-        <w:rPr>
-          <w:rFonts w:ascii="Georgia" w:hAnsi="Georgia"/>
-          <w:sz w:val="26"/>
-        </w:rPr>
-        <w:t>But look at seated: 272. That's only one more than before.</w:t>
-      </w:r>
-    </w:p>
-    <w:p>
-      <w:pPr>
-        <w:pStyle w:val="Heading2"/>
-      </w:pPr>
-      <w:r>
-        <w:t>5. A train that really was full</w:t>
+        <w:t>5. Why only six?</w:t>
       </w:r>
       <w:r>
         <w:rPr>
           <w:b w:val="0"/>
           <w:color w:val="5B35C8"/>
         </w:rPr>
-        <w:t xml:space="preserve">   0:20</w:t>
-      </w:r>
-    </w:p>
-    <w:p>
-      <w:pPr>
-        <w:shd w:val="clear" w:color="auto" w:fill="EEE8FB"/>
-        <w:spacing w:before="120" w:after="160"/>
-        <w:ind w:left="113" w:right="113"/>
-      </w:pPr>
-      <w:r>
-        <w:rPr>
-          <w:b/>
-          <w:color w:val="5B35C8"/>
-          <w:sz w:val="19"/>
-        </w:rPr>
-        <w:t xml:space="preserve">DO  </w:t>
-      </w:r>
-      <w:r>
-        <w:rPr>
-          <w:sz w:val="22"/>
-        </w:rPr>
-        <w:t xml:space="preserve">In the Waitlisted passengers box, click the first red number, </w:t>
-      </w:r>
-      <w:r>
-        <w:rPr>
-          <w:b/>
-          <w:sz w:val="22"/>
-        </w:rPr>
-        <w:t>196</w:t>
-      </w:r>
-      <w:r>
-        <w:rPr>
-          <w:sz w:val="22"/>
-        </w:rPr>
-        <w:t>.</w:t>
-      </w:r>
-    </w:p>
-    <w:p>
-      <w:pPr>
-        <w:pBdr>
-          <w:left w:val="single" w:sz="18" w:space="10" w:color="5B35C8"/>
-        </w:pBdr>
-        <w:spacing w:after="180" w:line="324" w:lineRule="auto"/>
-        <w:ind w:left="283"/>
-      </w:pPr>
-      <w:r>
-        <w:rPr>
-          <w:rFonts w:ascii="Georgia" w:hAnsi="Georgia"/>
-          <w:sz w:val="26"/>
-        </w:rPr>
-        <w:t>These red ones are different. Passenger 196, Bhopal to Delhi. One stretch of that trip already had 72 passengers on 72 berths, and the app lists all 72.</w:t>
-      </w:r>
-    </w:p>
-    <w:p>
-      <w:pPr>
-        <w:pBdr>
-          <w:left w:val="single" w:sz="18" w:space="10" w:color="5B35C8"/>
-        </w:pBdr>
-        <w:spacing w:after="180" w:line="324" w:lineRule="auto"/>
-        <w:ind w:left="283"/>
-      </w:pPr>
-      <w:r>
-        <w:rPr>
-          <w:rFonts w:ascii="Georgia" w:hAnsi="Georgia"/>
-          <w:sz w:val="26"/>
-        </w:rPr>
-        <w:t>That's pigeonhole. Nobody could have seated this person.</w:t>
-      </w:r>
-    </w:p>
-    <w:p>
-      <w:pPr>
-        <w:pStyle w:val="Heading2"/>
-      </w:pPr>
-      <w:r>
-        <w:t>6. Compare everything</w:t>
-      </w:r>
-      <w:r>
-        <w:rPr>
-          <w:b w:val="0"/>
-          <w:color w:val="5B35C8"/>
-        </w:rPr>
-        <w:t xml:space="preserve">   0:40</w:t>
-      </w:r>
-    </w:p>
-    <w:p>
-      <w:pPr>
-        <w:shd w:val="clear" w:color="auto" w:fill="EEE8FB"/>
-        <w:spacing w:before="120" w:after="160"/>
-        <w:ind w:left="113" w:right="113"/>
-      </w:pPr>
-      <w:r>
-        <w:rPr>
-          <w:b/>
-          <w:color w:val="5B35C8"/>
-          <w:sz w:val="19"/>
-        </w:rPr>
-        <w:t xml:space="preserve">DO  </w:t>
-      </w:r>
-      <w:r>
-        <w:rPr>
-          <w:sz w:val="22"/>
-        </w:rPr>
-        <w:t xml:space="preserve">Look at the table </w:t>
-      </w:r>
-      <w:r>
-        <w:rPr>
-          <w:b/>
-          <w:sz w:val="22"/>
-        </w:rPr>
-        <w:t>All strategies on this stream</w:t>
-      </w:r>
-      <w:r>
-        <w:rPr>
-          <w:sz w:val="22"/>
-        </w:rPr>
-        <w:t xml:space="preserve"> on the right. Scroll a little if it is cut off.</w:t>
-      </w:r>
-    </w:p>
-    <w:p>
-      <w:pPr>
-        <w:pBdr>
-          <w:left w:val="single" w:sz="18" w:space="10" w:color="5B35C8"/>
-        </w:pBdr>
-        <w:spacing w:after="180" w:line="324" w:lineRule="auto"/>
-        <w:ind w:left="283"/>
-      </w:pPr>
-      <w:r>
-        <w:rPr>
-          <w:rFonts w:ascii="Georgia" w:hAnsi="Georgia"/>
-          <w:sz w:val="26"/>
-        </w:rPr>
-        <w:t>This table has all five rules on the same requests. Best-fit picks the berth that leaves the smallest gap, and Random-fit just picks any free one.</w:t>
-      </w:r>
-    </w:p>
-    <w:p>
-      <w:pPr>
-        <w:pBdr>
-          <w:left w:val="single" w:sz="18" w:space="10" w:color="5B35C8"/>
-        </w:pBdr>
-        <w:spacing w:after="180" w:line="324" w:lineRule="auto"/>
-        <w:ind w:left="283"/>
-      </w:pPr>
-      <w:r>
-        <w:rPr>
-          <w:rFonts w:ascii="Georgia" w:hAnsi="Georgia"/>
-          <w:sz w:val="26"/>
-        </w:rPr>
-        <w:t>First-fit got 271, Deferred got 272. And the best you could possibly do, if you knew every request in advance, is 301.</w:t>
-      </w:r>
-    </w:p>
-    <w:p>
-      <w:pPr>
-        <w:pBdr>
-          <w:left w:val="single" w:sz="18" w:space="10" w:color="5B35C8"/>
-        </w:pBdr>
-        <w:spacing w:after="180" w:line="324" w:lineRule="auto"/>
-        <w:ind w:left="283"/>
-      </w:pPr>
-      <w:r>
-        <w:rPr>
-          <w:rFonts w:ascii="Georgia" w:hAnsi="Georgia"/>
-          <w:sz w:val="26"/>
-        </w:rPr>
-        <w:t>So on this train, fixing the berth allocation got us one seat. The bigger loss is simply that bookings are first come, first served.</w:t>
+        <w:t xml:space="preserve">   0:30</w:t>
       </w:r>
     </w:p>
     <w:p>
@@ -1617,13 +1357,13 @@
           <w:b/>
           <w:sz w:val="22"/>
         </w:rPr>
-        <w:t>With unlimited berths</w:t>
+        <w:t>Same passengers, other rules</w:t>
       </w:r>
       <w:r>
         <w:rPr>
           <w:sz w:val="22"/>
         </w:rPr>
-        <w:t>, just under the table.</w:t>
+        <w:t>, the three-line table on the right.</w:t>
       </w:r>
     </w:p>
     <w:p>
@@ -1639,22 +1379,38 @@
           <w:rFonts w:ascii="Georgia" w:hAnsi="Georgia"/>
           <w:sz w:val="26"/>
         </w:rPr>
-        <w:t>And this last box is Dilworth's theorem at work. To seat all 361 people you'd need at least 132 berths, because that's the busiest stretch. First-fit would use 138.</w:t>
+        <w:t>If 90 were fragmented, why only six? Because each of them had room at the moment they asked, but people kept booking after them and used that room.</w:t>
       </w:r>
     </w:p>
     <w:p>
       <w:pPr>
+        <w:pBdr>
+          <w:left w:val="single" w:sz="18" w:space="10" w:color="5B35C8"/>
+        </w:pBdr>
+        <w:spacing w:after="180" w:line="324" w:lineRule="auto"/>
+        <w:ind w:left="283"/>
+      </w:pPr>
+      <w:r>
+        <w:rPr>
+          <w:rFonts w:ascii="Georgia" w:hAnsi="Georgia"/>
+          <w:sz w:val="26"/>
+        </w:rPr>
+        <w:t>This runs other rules on the same 361 people. Deciding berths only at charting, Deferred, gets 272. The best possible, if you knew every request in advance, is 301. But that would mean refusing people who booked early, and you can't know the future.</w:t>
+      </w:r>
+    </w:p>
+    <w:p>
+      <w:pPr>
         <w:pStyle w:val="Heading2"/>
       </w:pPr>
       <w:r>
-        <w:t>7. Closing line</w:t>
+        <w:t>6. Closing</w:t>
       </w:r>
       <w:r>
         <w:rPr>
           <w:b w:val="0"/>
           <w:color w:val="5B35C8"/>
         </w:rPr>
-        <w:t xml:space="preserve">   0:10</w:t>
+        <w:t xml:space="preserve">   0:15</w:t>
       </w:r>
     </w:p>
     <w:p>
@@ -1691,7 +1447,7 @@
           <w:rFonts w:ascii="Georgia" w:hAnsi="Georgia"/>
           <w:sz w:val="26"/>
         </w:rPr>
-        <w:t>So that's my project. When you're waitlisted, the train often isn't full, and this can show it passenger by passenger.</w:t>
+        <w:t>So, to answer the question: when you're waitlisted, often the train isn't actually full, and this app can prove it passenger by passenger. Fixing the allocation wins back a few seats. The bigger loss is that we serve people first come, first served without knowing who comes next.</w:t>
       </w:r>
     </w:p>
     <w:p>
@@ -1707,7 +1463,7 @@
           <w:rFonts w:ascii="Georgia" w:hAnsi="Georgia"/>
           <w:sz w:val="26"/>
         </w:rPr>
-        <w:t>Thank you. I'm happy to take questions, or to run any train you like.</w:t>
+        <w:t>Thank you. Happy to take questions, or to run any train you like.</w:t>
       </w:r>
     </w:p>
     <w:p>
@@ -1724,7 +1480,7 @@
           <w:i/>
           <w:color w:val="4D4459"/>
         </w:rPr>
-        <w:t xml:space="preserve">Reload the page, set Route and Demand again from the checklist, press </w:t>
+        <w:t xml:space="preserve">Reload the page, set Route and Demand again, press </w:t>
       </w:r>
       <w:r>
         <w:rPr>
@@ -1732,7 +1488,7 @@
           <w:i/>
           <w:color w:val="4D4459"/>
         </w:rPr>
-        <w:t>Jump to end</w:t>
+        <w:t>End</w:t>
       </w:r>
       <w:r>
         <w:rPr>
@@ -1852,7 +1608,7 @@
         <w:rPr>
           <w:sz w:val="23"/>
         </w:rPr>
-        <w:t>accept the passenger if every stretch of their journey has room, but decide all the berth numbers together at charting, in boarding order.</w:t>
+        <w:t>accept the passenger if every stretch of their journey has room, but decide all the berth numbers together at charting, in boarding order. It never causes an amber rejection.</w:t>
       </w:r>
     </w:p>
     <w:p>
@@ -1880,9 +1636,179 @@
       </w:r>
     </w:p>
     <w:p>
+      <w:pPr>
+        <w:pStyle w:val="Heading2"/>
+      </w:pPr>
       <w:r>
-        <w:rPr/>
-        <w:t>The first three fix the berth at booking time, which is why they can turn someone away even when every stretch has room. Deferred never does that.</w:t>
+        <w:t>What the labels on screen mean</w:t>
+      </w:r>
+    </w:p>
+    <w:p>
+      <w:pPr>
+        <w:keepNext/>
+        <w:spacing w:after="40"/>
+      </w:pPr>
+      <w:r>
+        <w:rPr>
+          <w:b/>
+          <w:sz w:val="23"/>
+        </w:rPr>
+        <w:t>CNF, Seated:</w:t>
+      </w:r>
+    </w:p>
+    <w:p>
+      <w:pPr>
+        <w:spacing w:after="240"/>
+      </w:pPr>
+      <w:r>
+        <w:rPr>
+          <w:sz w:val="23"/>
+        </w:rPr>
+        <w:t>passengers with a confirmed berth.</w:t>
+      </w:r>
+    </w:p>
+    <w:p>
+      <w:pPr>
+        <w:keepNext/>
+        <w:spacing w:after="40"/>
+      </w:pPr>
+      <w:r>
+        <w:rPr>
+          <w:b/>
+          <w:sz w:val="23"/>
+        </w:rPr>
+        <w:t>WL, Waitlisted:</w:t>
+      </w:r>
+    </w:p>
+    <w:p>
+      <w:pPr>
+        <w:spacing w:after="240"/>
+      </w:pPr>
+      <w:r>
+        <w:rPr>
+          <w:sz w:val="23"/>
+        </w:rPr>
+        <w:t>requests turned away so far.</w:t>
+      </w:r>
+    </w:p>
+    <w:p>
+      <w:pPr>
+        <w:keepNext/>
+        <w:spacing w:after="40"/>
+      </w:pPr>
+      <w:r>
+        <w:rPr>
+          <w:b/>
+          <w:sz w:val="23"/>
+        </w:rPr>
+        <w:t>REGRET, Full here:</w:t>
+      </w:r>
+    </w:p>
+    <w:p>
+      <w:pPr>
+        <w:spacing w:after="240"/>
+      </w:pPr>
+      <w:r>
+        <w:rPr>
+          <w:sz w:val="23"/>
+        </w:rPr>
+        <w:t>red. Some stretch of the journey was already full.</w:t>
+      </w:r>
+    </w:p>
+    <w:p>
+      <w:pPr>
+        <w:keepNext/>
+        <w:spacing w:after="40"/>
+      </w:pPr>
+      <w:r>
+        <w:rPr>
+          <w:b/>
+          <w:sz w:val="23"/>
+        </w:rPr>
+        <w:t>FRAG, Fragmented:</w:t>
+      </w:r>
+    </w:p>
+    <w:p>
+      <w:pPr>
+        <w:spacing w:after="240"/>
+      </w:pPr>
+      <w:r>
+        <w:rPr>
+          <w:sz w:val="23"/>
+        </w:rPr>
+        <w:t>amber. Every stretch had room, but no single berth was free end to end.</w:t>
+      </w:r>
+    </w:p>
+    <w:p>
+      <w:pPr>
+        <w:keepNext/>
+        <w:spacing w:after="40"/>
+      </w:pPr>
+      <w:r>
+        <w:rPr>
+          <w:b/>
+          <w:sz w:val="23"/>
+        </w:rPr>
+        <w:t>Packing Eff.</w:t>
+      </w:r>
+    </w:p>
+    <w:p>
+      <w:pPr>
+        <w:spacing w:after="240"/>
+      </w:pPr>
+      <w:r>
+        <w:rPr>
+          <w:sz w:val="23"/>
+        </w:rPr>
+        <w:t>(under Show all options): passengers seated divided by the most any seating could have fitted for the same requests. Call it the "empirical performance ratio", never a "competitive ratio".</w:t>
+      </w:r>
+    </w:p>
+    <w:p>
+      <w:pPr>
+        <w:keepNext/>
+        <w:spacing w:after="40"/>
+      </w:pPr>
+      <w:r>
+        <w:rPr>
+          <w:b/>
+          <w:sz w:val="23"/>
+        </w:rPr>
+        <w:t>Lost seats:</w:t>
+      </w:r>
+    </w:p>
+    <w:p>
+      <w:pPr>
+        <w:spacing w:after="240"/>
+      </w:pPr>
+      <w:r>
+        <w:rPr>
+          <w:sz w:val="23"/>
+        </w:rPr>
+        <w:t>how many fewer that rule seated than Deferred on this stream.</w:t>
+      </w:r>
+    </w:p>
+    <w:p>
+      <w:pPr>
+        <w:keepNext/>
+        <w:spacing w:after="40"/>
+      </w:pPr>
+      <w:r>
+        <w:rPr>
+          <w:b/>
+          <w:sz w:val="23"/>
+        </w:rPr>
+        <w:t>With unlimited berths</w:t>
+      </w:r>
+    </w:p>
+    <w:p>
+      <w:pPr>
+        <w:spacing w:after="240"/>
+      </w:pPr>
+      <w:r>
+        <w:rPr>
+          <w:sz w:val="23"/>
+        </w:rPr>
+        <w:t>(under Show all options): how many berths you would need to seat everyone. The minimum equals the busiest stretch, 132 here, which is Dilworth's theorem. First-fit would use 138.</w:t>
       </w:r>
     </w:p>
     <w:p>
@@ -1938,7 +1864,7 @@
         <w:rPr>
           <w:sz w:val="23"/>
         </w:rPr>
-        <w:t>the "With unlimited berths" box, where the minimum number of berths equals the busiest stretch.</w:t>
+        <w:t>the "With unlimited berths" box, where the fewest berths needed equals the busiest stretch.</w:t>
       </w:r>
     </w:p>
     <w:p>
@@ -1986,7 +1912,7 @@
         <w:rPr>
           <w:sz w:val="23"/>
         </w:rPr>
-        <w:t>a seating is a function from bookings to berths, and two overlapping bookings never get the same berth.</w:t>
+        <w:t>a seating is a function from bookings to berths; overlapping bookings never get the same berth.</w:t>
       </w:r>
     </w:p>
     <w:p>
@@ -2010,7 +1936,7 @@
         <w:rPr>
           <w:sz w:val="23"/>
         </w:rPr>
-        <w:t>the strategies. First-fit is greedy colouring, and Deferred colours in boarding order, which always works on an interval graph.</w:t>
+        <w:t>the strategies. First-fit is greedy colouring; Deferred colours in boarding order, which always works on an interval graph.</w:t>
       </w:r>
     </w:p>
     <w:p>
@@ -2023,7 +1949,7 @@
           <w:b/>
           <w:sz w:val="23"/>
         </w:rPr>
-        <w:t>Proofs:</w:t>
+        <w:t>Constructive proof:</w:t>
       </w:r>
     </w:p>
     <w:p>
@@ -2034,7 +1960,87 @@
         <w:rPr>
           <w:sz w:val="23"/>
         </w:rPr>
-        <w:t>the amber "Assignment" proof is a constructive proof. It shows an actual seating that fits everyone.</w:t>
+        <w:t>the amber proof shows an actual seating that fits everyone.</w:t>
+      </w:r>
+    </w:p>
+    <w:p>
+      <w:pPr>
+        <w:keepNext/>
+        <w:spacing w:after="40"/>
+      </w:pPr>
+      <w:r>
+        <w:rPr>
+          <w:b/>
+          <w:sz w:val="23"/>
+        </w:rPr>
+        <w:t>Greedy algorithm with an exchange argument:</w:t>
+      </w:r>
+    </w:p>
+    <w:p>
+      <w:pPr>
+        <w:spacing w:after="240"/>
+      </w:pPr>
+      <w:r>
+        <w:rPr>
+          <w:sz w:val="23"/>
+        </w:rPr>
+        <w:t>re-charting takes waitlisted passengers in order of where they get off and adds each one that still fits. Swapping any other choice for this one never makes things worse, so it reaches the maximum.</w:t>
+      </w:r>
+    </w:p>
+    <w:p>
+      <w:pPr>
+        <w:pStyle w:val="Heading2"/>
+      </w:pPr>
+      <w:r>
+        <w:t>The theorem, in two lines</w:t>
+      </w:r>
+    </w:p>
+    <w:p>
+      <w:pPr>
+        <w:keepNext/>
+        <w:spacing w:after="40"/>
+      </w:pPr>
+      <w:r>
+        <w:rPr>
+          <w:b/>
+          <w:sz w:val="23"/>
+        </w:rPr>
+        <w:t>If more than k people are on one stretch,</w:t>
+      </w:r>
+    </w:p>
+    <w:p>
+      <w:pPr>
+        <w:spacing w:after="240"/>
+      </w:pPr>
+      <w:r>
+        <w:rPr>
+          <w:sz w:val="23"/>
+        </w:rPr>
+        <w:t>they cannot share k berths: pigeonhole.</w:t>
+      </w:r>
+    </w:p>
+    <w:p>
+      <w:pPr>
+        <w:keepNext/>
+        <w:spacing w:after="40"/>
+      </w:pPr>
+      <w:r>
+        <w:rPr>
+          <w:b/>
+          <w:sz w:val="23"/>
+        </w:rPr>
+        <w:t>If no stretch has more than k,</w:t>
+      </w:r>
+    </w:p>
+    <w:p>
+      <w:pPr>
+        <w:spacing w:after="240"/>
+      </w:pPr>
+      <w:r>
+        <w:rPr>
+          <w:sz w:val="23"/>
+        </w:rPr>
+        <w:t>seat people in order of boarding, each on the lowest free berth. When someone boards, everyone whose berth is still busy is on the same stretch as them. That stretch holds at most k people including the newcomer, so at most k − 1 berths are busy and one is free.</w:t>
       </w:r>
     </w:p>
     <w:p>
@@ -2090,7 +2096,7 @@
         <w:rPr>
           <w:sz w:val="23"/>
         </w:rPr>
-        <w:t>an AI system built by CRIS, the Railways' own software arm. It learns from past bookings and adjusts how berths are split between station pairs. It was tried on over 200 trains. It is internal, so passengers can't see how it decides.</w:t>
+        <w:t>an AI system by CRIS, the Railways' software arm. It learns from past bookings and adjusts how berths are split between station pairs, and has been rolled out on over 200 trains. It is internal, so passengers can't see how it decides.</w:t>
       </w:r>
     </w:p>
     <w:p>
@@ -2250,6 +2256,110 @@
         <w:pStyle w:val="Heading2"/>
       </w:pPr>
       <w:r>
+        <w:t>How we know it is right</w:t>
+      </w:r>
+    </w:p>
+    <w:p>
+      <w:pPr>
+        <w:keepNext/>
+        <w:spacing w:after="40"/>
+      </w:pPr>
+      <w:r>
+        <w:rPr>
+          <w:b/>
+          <w:sz w:val="23"/>
+        </w:rPr>
+        <w:t>141 automated tests,</w:t>
+      </w:r>
+    </w:p>
+    <w:p>
+      <w:pPr>
+        <w:spacing w:after="240"/>
+      </w:pPr>
+      <w:r>
+        <w:rPr>
+          <w:sz w:val="23"/>
+        </w:rPr>
+        <w:t>covering 99.7% of the engine.</w:t>
+      </w:r>
+    </w:p>
+    <w:p>
+      <w:pPr>
+        <w:keepNext/>
+        <w:spacing w:after="40"/>
+      </w:pPr>
+      <w:r>
+        <w:rPr>
+          <w:b/>
+          <w:sz w:val="23"/>
+        </w:rPr>
+        <w:t>Brute force:</w:t>
+      </w:r>
+    </w:p>
+    <w:p>
+      <w:pPr>
+        <w:spacing w:after="240"/>
+      </w:pPr>
+      <w:r>
+        <w:rPr>
+          <w:sz w:val="23"/>
+        </w:rPr>
+        <w:t>on hundreds of small random cases, the optimum and the re-chart are compared with trying every possible subset.</w:t>
+      </w:r>
+    </w:p>
+    <w:p>
+      <w:pPr>
+        <w:keepNext/>
+        <w:spacing w:after="40"/>
+      </w:pPr>
+      <w:r>
+        <w:rPr>
+          <w:b/>
+          <w:sz w:val="23"/>
+        </w:rPr>
+        <w:t>Every proof is re-checked:</w:t>
+      </w:r>
+    </w:p>
+    <w:p>
+      <w:pPr>
+        <w:spacing w:after="240"/>
+      </w:pPr>
+      <w:r>
+        <w:rPr>
+          <w:sz w:val="23"/>
+        </w:rPr>
+        <w:t>each red and amber verdict is recomputed independently in the tests.</w:t>
+      </w:r>
+    </w:p>
+    <w:p>
+      <w:pPr>
+        <w:keepNext/>
+        <w:spacing w:after="40"/>
+      </w:pPr>
+      <w:r>
+        <w:rPr>
+          <w:b/>
+          <w:sz w:val="23"/>
+        </w:rPr>
+        <w:t>Same seed, same result:</w:t>
+      </w:r>
+    </w:p>
+    <w:p>
+      <w:pPr>
+        <w:spacing w:after="240"/>
+      </w:pPr>
+      <w:r>
+        <w:rPr>
+          <w:sz w:val="23"/>
+        </w:rPr>
+        <w:t>every run can be repeated exactly.</w:t>
+      </w:r>
+    </w:p>
+    <w:p>
+      <w:pPr>
+        <w:pStyle w:val="Heading2"/>
+      </w:pPr>
+      <w:r>
         <w:t>Questions you may get</w:t>
       </w:r>
     </w:p>
@@ -2274,7 +2384,7 @@
         <w:rPr>
           <w:sz w:val="23"/>
         </w:rPr>
-        <w:t>No, their method isn't published. I compare a few standard ways of doing it on real routes.</w:t>
+        <w:t>No, their method isn't published. I compare standard ways of doing it on real routes.</w:t>
       </w:r>
     </w:p>
     <w:p>
@@ -2311,7 +2421,79 @@
           <w:b/>
           <w:sz w:val="23"/>
         </w:rPr>
-        <w:t>Is one seat the usual gain?</w:t>
+        <w:t>Why did re-charting seat only 6 of the 90?</w:t>
+      </w:r>
+    </w:p>
+    <w:p>
+      <w:pPr>
+        <w:spacing w:after="240"/>
+      </w:pPr>
+      <w:r>
+        <w:rPr>
+          <w:sz w:val="23"/>
+        </w:rPr>
+        <w:t>Each of the 90 had room when they asked, but later passengers used it. By the end they all need the same few free berths on the busiest stretch.</w:t>
+      </w:r>
+    </w:p>
+    <w:p>
+      <w:pPr>
+        <w:keepNext/>
+        <w:spacing w:after="40"/>
+      </w:pPr>
+      <w:r>
+        <w:rPr>
+          <w:b/>
+          <w:sz w:val="23"/>
+        </w:rPr>
+        <w:t>Could you seat more than 6?</w:t>
+      </w:r>
+    </w:p>
+    <w:p>
+      <w:pPr>
+        <w:spacing w:after="240"/>
+      </w:pPr>
+      <w:r>
+        <w:rPr>
+          <w:sz w:val="23"/>
+        </w:rPr>
+        <w:t>Only by cancelling people who already have tickets. The best possible plan seats 56 of the 90, but it refuses 26 people First-fit had confirmed.</w:t>
+      </w:r>
+    </w:p>
+    <w:p>
+      <w:pPr>
+        <w:keepNext/>
+        <w:spacing w:after="40"/>
+      </w:pPr>
+      <w:r>
+        <w:rPr>
+          <w:b/>
+          <w:sz w:val="23"/>
+        </w:rPr>
+        <w:t>Does re-charting respect the waitlist order?</w:t>
+      </w:r>
+    </w:p>
+    <w:p>
+      <w:pPr>
+        <w:spacing w:after="240"/>
+      </w:pPr>
+      <w:r>
+        <w:rPr>
+          <w:sz w:val="23"/>
+        </w:rPr>
+        <w:t>No, it maximises the number of people seated. It can seat two later short trips instead of one earlier long one.</w:t>
+      </w:r>
+    </w:p>
+    <w:p>
+      <w:pPr>
+        <w:keepNext/>
+        <w:spacing w:after="40"/>
+      </w:pPr>
+      <w:r>
+        <w:rPr>
+          <w:b/>
+          <w:sz w:val="23"/>
+        </w:rPr>
+        <w:t>Is one seat the usual gain from Deferred?</w:t>
       </w:r>
     </w:p>
     <w:p>
@@ -2323,30 +2505,6 @@
           <w:sz w:val="23"/>
         </w:rPr>
         <w:t>That was one day on one train. The full results over many runs are in the research part of the project, on the Findings page.</w:t>
-      </w:r>
-    </w:p>
-    <w:p>
-      <w:pPr>
-        <w:keepNext/>
-        <w:spacing w:after="40"/>
-      </w:pPr>
-      <w:r>
-        <w:rPr>
-          <w:b/>
-          <w:sz w:val="23"/>
-        </w:rPr>
-        <w:t>Why not just use the best possible method?</w:t>
-      </w:r>
-    </w:p>
-    <w:p>
-      <w:pPr>
-        <w:spacing w:after="240"/>
-      </w:pPr>
-      <w:r>
-        <w:rPr>
-          <w:sz w:val="23"/>
-        </w:rPr>
-        <w:t>It needs every future request in advance, so nobody can run it. It's only there as a ceiling to compare against.</w:t>
       </w:r>
     </w:p>
     <w:p>
@@ -2370,7 +2528,7 @@
         <w:rPr>
           <w:sz w:val="23"/>
         </w:rPr>
-        <w:t>The theorem is a known one. What I built is an app that proves, for each rejected passenger, whether the train was really full.</w:t>
+        <w:t>The theorem is a known one. What I built is an app that proves, for each rejected passenger, whether the train was really full, and then seats as many of them as possible.</w:t>
       </w:r>
     </w:p>
     <w:sectPr>

</xml_diff>

<commit_message>
feat: update talk script formatting to highlight concepts and actions for improved clarity
</commit_message>
<xml_diff>
--- a/docs/TALK.docx
+++ b/docs/TALK.docx
@@ -25,7 +25,7 @@
     <w:p>
       <w:r>
         <w:rPr/>
-        <w:t xml:space="preserve">Three slides, then the simulator. About 7 minutes; the cuts for a 4-minute version are listed below. Deck: </w:t>
+        <w:t xml:space="preserve">Four slides, then the simulator. About 9 minutes in full; the cuts below bring it to about 6. Deck: </w:t>
       </w:r>
       <w:hyperlink r:id="rId11">
         <w:r>
@@ -134,7 +134,7 @@
             </w:pPr>
             <w:r>
               <w:rPr/>
-              <w:t>Slide 2: the problem, what exists, our solution</w:t>
+              <w:t>Slide 2: it happens in real life</w:t>
             </w:r>
           </w:p>
         </w:tc>
@@ -148,7 +148,7 @@
             </w:pPr>
             <w:r>
               <w:rPr/>
-              <w:t>1:20</w:t>
+              <w:t>0:40</w:t>
             </w:r>
           </w:p>
         </w:tc>
@@ -164,7 +164,7 @@
             </w:pPr>
             <w:r>
               <w:rPr/>
-              <w:t>Slide 3: the maths, and why TypeScript</w:t>
+              <w:t>Slide 3: the problem, what exists, our solution</w:t>
             </w:r>
           </w:p>
         </w:tc>
@@ -178,7 +178,37 @@
             </w:pPr>
             <w:r>
               <w:rPr/>
-              <w:t>2:00</w:t>
+              <w:t>1:30</w:t>
+            </w:r>
+          </w:p>
+        </w:tc>
+      </w:tr>
+      <w:tr>
+        <w:tc>
+          <w:tcPr>
+            <w:tcW w:type="dxa" w:w="7370"/>
+          </w:tcPr>
+          <w:p>
+            <w:pPr>
+              <w:spacing w:before="60" w:after="60"/>
+            </w:pPr>
+            <w:r>
+              <w:rPr/>
+              <w:t>Slide 4: the maths, and why TypeScript</w:t>
+            </w:r>
+          </w:p>
+        </w:tc>
+        <w:tc>
+          <w:tcPr>
+            <w:tcW w:type="dxa" w:w="1701"/>
+          </w:tcPr>
+          <w:p>
+            <w:pPr>
+              <w:spacing w:before="60" w:after="60"/>
+            </w:pPr>
+            <w:r>
+              <w:rPr/>
+              <w:t>2:15</w:t>
             </w:r>
           </w:p>
         </w:tc>
@@ -208,7 +238,7 @@
             </w:pPr>
             <w:r>
               <w:rPr/>
-              <w:t>2:50</w:t>
+              <w:t>3:20</w:t>
             </w:r>
           </w:p>
         </w:tc>
@@ -332,11 +362,11 @@
         <w:rPr>
           <w:b/>
         </w:rPr>
-        <w:t>For a 4-minute version,</w:t>
+        <w:t>For a shorter version,</w:t>
       </w:r>
       <w:r>
         <w:rPr/>
-        <w:t xml:space="preserve"> cut these. Together they save about 2:30, which brings it to about 4:15.</w:t>
+        <w:t xml:space="preserve"> make these cuts. Together they save about 3 minutes, which brings it to about 6. Keep the Concept lines in the demo: they are what links the maths to the app.</w:t>
       </w:r>
     </w:p>
     <w:p>
@@ -345,7 +375,7 @@
       </w:pPr>
       <w:r>
         <w:rPr/>
-        <w:t>1. Slide 2: say "what exists" in one sentence (saves 0:15).</w:t>
+        <w:t>1. Slide 1: skip the second sentence (saves 0:10).</w:t>
       </w:r>
     </w:p>
     <w:p>
@@ -354,7 +384,7 @@
       </w:pPr>
       <w:r>
         <w:rPr/>
-        <w:t>2. Slide 3: one sentence per concept, and skip the transitivity example (saves 0:50).</w:t>
+        <w:t>2. Slide 2: say only the first card and the last line (saves 0:25).</w:t>
       </w:r>
     </w:p>
     <w:p>
@@ -363,7 +393,7 @@
       </w:pPr>
       <w:r>
         <w:rPr/>
-        <w:t>3. Slide 3: skip TypeScript; keep it for questions (saves 0:20).</w:t>
+        <w:t>3. Slide 3: say "what exists" in one sentence (saves 0:15).</w:t>
       </w:r>
     </w:p>
     <w:p>
@@ -372,7 +402,7 @@
       </w:pPr>
       <w:r>
         <w:rPr/>
-        <w:t>4. Demo step 1: just "rows are berths, columns are stretches" (saves 0:10).</w:t>
+        <w:t>4. Slide 4: one sentence per concept, since the demo names each one again, and skip the transitivity example (saves 0:50).</w:t>
       </w:r>
     </w:p>
     <w:p>
@@ -381,7 +411,7 @@
       </w:pPr>
       <w:r>
         <w:rPr/>
-        <w:t>5. Demo step 3: skip "Show a seating"; re-chart in step 4 makes the same point (saves 0:15).</w:t>
+        <w:t>5. Slide 4: skip TypeScript; keep it for questions (saves 0:20).</w:t>
       </w:r>
     </w:p>
     <w:p>
@@ -390,7 +420,7 @@
       </w:pPr>
       <w:r>
         <w:rPr/>
-        <w:t>6. Demo step 5: keep only the first paragraph (saves 0:20).</w:t>
+        <w:t>6. Demo step 1: just "rows are berths, columns are stretches" (saves 0:10).</w:t>
       </w:r>
     </w:p>
     <w:p>
@@ -399,7 +429,22 @@
       </w:pPr>
       <w:r>
         <w:rPr/>
-        <w:t>7. Slide 1: skip the second sentence (saves 0:10).</w:t>
+        <w:t>7. Demo step 3: skip "Show a seating"; re-chart in step 4 makes the same point (saves 0:20).</w:t>
+      </w:r>
+    </w:p>
+    <w:p>
+      <w:pPr>
+        <w:ind w:left="340"/>
+      </w:pPr>
+      <w:r>
+        <w:rPr/>
+        <w:t>8. Demo step 5: keep only the first paragraph (saves 0:25).</w:t>
+      </w:r>
+    </w:p>
+    <w:p>
+      <w:r>
+        <w:rPr/>
+        <w:t>For a strict 4 to 5 minutes, also drop slide 2, the "what exists" strip on slide 3 and demo step 5, and keep them for questions.</w:t>
       </w:r>
     </w:p>
     <w:p>
@@ -596,7 +641,7 @@
           <w:rFonts w:ascii="Georgia" w:hAnsi="Georgia"/>
           <w:sz w:val="26"/>
         </w:rPr>
-        <w:t>Hi everyone, I'm Neel. Most of us have been on a train waiting list, and then walked through that same train and seen empty berths.</w:t>
+        <w:t>Hi everyone, I'm Neel. Most of us have been on a train waiting list. And then we got on that same train and saw empty berths.</w:t>
       </w:r>
     </w:p>
     <w:p>
@@ -612,22 +657,135 @@
           <w:rFonts w:ascii="Georgia" w:hAnsi="Georgia"/>
           <w:sz w:val="26"/>
         </w:rPr>
-        <w:t>So my project asks one question: when you're waitlisted, is the train really full? I'll show you the problem, the maths behind it, and then the app I built to answer it.</w:t>
+        <w:t>So my project asks one simple question: when you are waitlisted, is the train really full?</w:t>
       </w:r>
     </w:p>
     <w:p>
       <w:pPr>
+        <w:pBdr>
+          <w:left w:val="single" w:sz="18" w:space="10" w:color="5B35C8"/>
+        </w:pBdr>
+        <w:spacing w:after="180" w:line="324" w:lineRule="auto"/>
+        <w:ind w:left="283"/>
+      </w:pPr>
+      <w:r>
+        <w:rPr>
+          <w:rFonts w:ascii="Georgia" w:hAnsi="Georgia"/>
+          <w:sz w:val="26"/>
+        </w:rPr>
+        <w:t>I'll show you the problem, the maths behind it, and then the app I built to answer it.</w:t>
+      </w:r>
+    </w:p>
+    <w:p>
+      <w:pPr>
         <w:pStyle w:val="Heading2"/>
       </w:pPr>
       <w:r>
-        <w:t>Slide 2: The problem, and our solution</w:t>
+        <w:t>Slide 2: It happens in real life</w:t>
       </w:r>
       <w:r>
         <w:rPr>
           <w:b w:val="0"/>
           <w:color w:val="5B35C8"/>
         </w:rPr>
-        <w:t xml:space="preserve">   1:20</w:t>
+        <w:t xml:space="preserve">   0:40</w:t>
+      </w:r>
+    </w:p>
+    <w:p>
+      <w:r>
+        <w:rPr>
+          <w:i/>
+          <w:color w:val="4D4459"/>
+        </w:rPr>
+        <w:t>Point at each card in turn.</w:t>
+      </w:r>
+    </w:p>
+    <w:p>
+      <w:pPr>
+        <w:pBdr>
+          <w:left w:val="single" w:sz="18" w:space="10" w:color="5B35C8"/>
+        </w:pBdr>
+        <w:spacing w:after="180" w:line="324" w:lineRule="auto"/>
+        <w:ind w:left="283"/>
+      </w:pPr>
+      <w:r>
+        <w:rPr>
+          <w:rFonts w:ascii="Georgia" w:hAnsi="Georgia"/>
+          <w:sz w:val="26"/>
+        </w:rPr>
+        <w:t>First, this is a real problem. RTI data from this year says that in 2025–26, 3.39 crore people could not travel. Their waitlisted ticket never got confirmed.</w:t>
+      </w:r>
+    </w:p>
+    <w:p>
+      <w:pPr>
+        <w:pBdr>
+          <w:left w:val="single" w:sz="18" w:space="10" w:color="5B35C8"/>
+        </w:pBdr>
+        <w:spacing w:after="180" w:line="324" w:lineRule="auto"/>
+        <w:ind w:left="283"/>
+      </w:pPr>
+      <w:r>
+        <w:rPr>
+          <w:rFonts w:ascii="Georgia" w:hAnsi="Georgia"/>
+          <w:sz w:val="26"/>
+        </w:rPr>
+        <w:t>But berths do go empty. In 2022, ticket checkers on running trains were finding about 7,000 empty berths every day. About 2,700 waitlisted people a day got one of them.</w:t>
+      </w:r>
+    </w:p>
+    <w:p>
+      <w:pPr>
+        <w:pBdr>
+          <w:left w:val="single" w:sz="18" w:space="10" w:color="5B35C8"/>
+        </w:pBdr>
+        <w:spacing w:after="180" w:line="324" w:lineRule="auto"/>
+        <w:ind w:left="283"/>
+      </w:pPr>
+      <w:r>
+        <w:rPr>
+          <w:rFonts w:ascii="Georgia" w:hAnsi="Georgia"/>
+          <w:sz w:val="26"/>
+        </w:rPr>
+        <w:t>And since 2016, the Railways give berths that are still empty after the final chart to waitlisted people at later stations.</w:t>
+      </w:r>
+    </w:p>
+    <w:p>
+      <w:r>
+        <w:rPr>
+          <w:i/>
+          <w:color w:val="4D4459"/>
+        </w:rPr>
+        <w:t>Point at the line at the bottom.</w:t>
+      </w:r>
+    </w:p>
+    <w:p>
+      <w:pPr>
+        <w:pBdr>
+          <w:left w:val="single" w:sz="18" w:space="10" w:color="5B35C8"/>
+        </w:pBdr>
+        <w:spacing w:after="180" w:line="324" w:lineRule="auto"/>
+        <w:ind w:left="283"/>
+      </w:pPr>
+      <w:r>
+        <w:rPr>
+          <w:rFonts w:ascii="Georgia" w:hAnsi="Georgia"/>
+          <w:sz w:val="26"/>
+        </w:rPr>
+        <w:t>Berths go empty for many reasons, like no-shows and cancellations. My project looks at one reason: the way berths are given out when people book.</w:t>
+      </w:r>
+    </w:p>
+    <w:p>
+      <w:pPr>
+        <w:pStyle w:val="Heading2"/>
+      </w:pPr>
+      <w:r>
+        <w:t>Slide 3: The problem, and our solution</w:t>
+      </w:r>
+      <w:r>
+        <w:rPr>
+          <w:b w:val="0"/>
+          <w:color w:val="5B35C8"/>
+        </w:rPr>
+        <w:t xml:space="preserve">   1:30</w:t>
       </w:r>
     </w:p>
     <w:p>
@@ -652,7 +810,7 @@
           <w:rFonts w:ascii="Georgia" w:hAnsi="Georgia"/>
           <w:sz w:val="26"/>
         </w:rPr>
-        <w:t>Here's the smallest example. Two berths, Mumbai to Delhi, through Surat. Berth 1 is free till Surat, and berth 2 is free after Surat.</w:t>
+        <w:t>Here is the smallest example. A coach with two berths, going from Mumbai to Delhi through Surat. Berth 1 is free from Mumbai to Surat. Berth 2 is free from Surat to Delhi.</w:t>
       </w:r>
     </w:p>
     <w:p>
@@ -668,7 +826,7 @@
           <w:rFonts w:ascii="Georgia" w:hAnsi="Georgia"/>
           <w:sz w:val="26"/>
         </w:rPr>
-        <w:t>Someone wants to go all the way. There's a free berth on both halves of the trip, but they're still waitlisted, because no single berth is free from start to end, and you can't change berths halfway.</w:t>
+        <w:t>Now someone wants to go from Mumbai all the way to Delhi. Each half of the trip has a free berth. But no single berth is free for the whole trip, and you can't change berths halfway. So this person is waitlisted.</w:t>
       </w:r>
     </w:p>
     <w:p>
@@ -684,7 +842,7 @@
           <w:rFonts w:ascii="Georgia" w:hAnsi="Georgia"/>
           <w:sz w:val="26"/>
         </w:rPr>
-        <w:t>So there are two reasons you can be waitlisted. Either some part of your journey is genuinely full: I'll show that in red and call it "full here". Or there was room everywhere, just in the wrong places, because of how earlier berths were given out: that's amber, "fragmented".</w:t>
+        <w:t>So there are two reasons you can be waitlisted. One: the train really is full on some part of your trip. I'll show that in red, and call it "full here". Two: there was space on every part of your trip, just not on one berth. That happens because of how earlier berths were given out. I'll show that in amber, and call it "fragmented".</w:t>
       </w:r>
     </w:p>
     <w:p>
@@ -709,7 +867,7 @@
           <w:rFonts w:ascii="Georgia" w:hAnsi="Georgia"/>
           <w:sz w:val="26"/>
         </w:rPr>
-        <w:t>Apps like ConfirmTkt predict whether your waitlist will confirm. The Railways' own AI, Ideal Train Profile, adjusts quotas between stations. And a research paper, "The Seat Reservation Problem", studies the worst case in theory. None of them tells a passenger which of the two reasons it was.</w:t>
+        <w:t>What exists today? Apps like ConfirmTkt guess whether your waitlist will clear. The Railways have an AI system that adjusts seat quotas between stations. And there is a research paper on the worst case, in theory. But none of them tells you which of the two reasons it was.</w:t>
       </w:r>
     </w:p>
     <w:p>
@@ -734,7 +892,7 @@
           <w:rFonts w:ascii="Georgia" w:hAnsi="Georgia"/>
           <w:sz w:val="26"/>
         </w:rPr>
-        <w:t>So I built a simulator that replays a real train's bookings, and for every waitlisted passenger proves whether it was red or amber. Then it re-charts the coach to seat as many waitlisted people as possible, and it compares five ways of giving out berths on exactly the same passengers.</w:t>
+        <w:t>So I built a simulator. It replays a real train's bookings, one by one. For every waitlisted person, it proves whether the reason was red or amber. Then it re-plans the berths to fit in as many waitlisted people as possible. And it compares five different rules for giving out berths, on exactly the same passengers.</w:t>
       </w:r>
     </w:p>
     <w:p>
@@ -742,14 +900,14 @@
         <w:pStyle w:val="Heading2"/>
       </w:pPr>
       <w:r>
-        <w:t>Slide 3: Where discrete maths comes in</w:t>
+        <w:t>Slide 4: Where discrete maths comes in</w:t>
       </w:r>
       <w:r>
         <w:rPr>
           <w:b w:val="0"/>
           <w:color w:val="5B35C8"/>
         </w:rPr>
-        <w:t xml:space="preserve">   2:00</w:t>
+        <w:t xml:space="preserve">   2:15</w:t>
       </w:r>
     </w:p>
     <w:p>
@@ -774,7 +932,7 @@
           <w:rFonts w:ascii="Georgia" w:hAnsi="Georgia"/>
           <w:sz w:val="26"/>
         </w:rPr>
-        <w:t>Everything starts from one modelling choice. A booking is an interval on the route, from where you board up to where you get off. If I get off at Surat and you board at Surat, our intervals only touch, so we can share a berth.</w:t>
+        <w:t>First, how I turn the train into maths. A booking is just a piece of the route. It runs from the station where you get on to the station where you get off. If I get off at Surat and you get on at Surat, our trips don't overlap. So we can use the same berth.</w:t>
       </w:r>
     </w:p>
     <w:p>
@@ -799,7 +957,7 @@
           <w:rFonts w:ascii="Georgia" w:hAnsi="Georgia"/>
           <w:sz w:val="26"/>
         </w:rPr>
-        <w:t>Relations: two bookings are related if they overlap. It's reflexive and symmetric, but not transitive. Mumbai to Surat overlaps Mumbai to Delhi, which overlaps Surat to Delhi, but Mumbai to Surat and Surat to Delhi only touch. The app checks this relation every time it looks for a free berth.</w:t>
+        <w:t>Relations. Two bookings are related if their trips overlap. This relation is reflexive and symmetric, but not transitive. For example, Mumbai–Surat overlaps Mumbai–Delhi, and Mumbai–Delhi overlaps Surat–Delhi. But Mumbai–Surat and Surat–Delhi don't overlap. The app uses this check every time it looks for a free berth.</w:t>
       </w:r>
     </w:p>
     <w:p>
@@ -815,7 +973,7 @@
           <w:rFonts w:ascii="Georgia" w:hAnsi="Georgia"/>
           <w:sz w:val="26"/>
         </w:rPr>
-        <w:t>Partial orders: one booking comes before another if it ends before the other starts. The passengers on one berth form a chain. Passengers who all overlap form an antichain, so each needs a different berth.</w:t>
+        <w:t>Partial orders. Say one trip comes "before" another if it ends before the other one starts. Then the passengers on one berth form a chain: one after another. Passengers whose trips all overlap form an antichain: each of them needs their own berth.</w:t>
       </w:r>
     </w:p>
     <w:p>
@@ -831,7 +989,7 @@
           <w:rFonts w:ascii="Georgia" w:hAnsi="Georgia"/>
           <w:sz w:val="26"/>
         </w:rPr>
-        <w:t>Functions and pigeonhole: a seating is a function from bookings to berths. If one stretch already has 72 people on 72 berths, a 73rd can't fit. That's the proof behind every red rejection.</w:t>
+        <w:t>Functions and pigeonhole. Giving out berths is a function: each passenger goes to one berth. If one stretch already has 72 people and there are only 72 berths, a 73rd person can't fit. That's the pigeonhole principle, and it is how the app proves a red rejection.</w:t>
       </w:r>
     </w:p>
     <w:p>
@@ -847,7 +1005,7 @@
           <w:rFonts w:ascii="Georgia" w:hAnsi="Georgia"/>
           <w:sz w:val="26"/>
         </w:rPr>
-        <w:t>Graph colouring: make each booking a vertex and join two that overlap. Giving out berths is colouring this graph, and each strategy is a different colouring rule.</w:t>
+        <w:t>Graph colouring. Draw each booking as a dot, and join two dots if their trips overlap. Giving out berths is colouring the dots: each berth is a colour, and joined dots need different colours. Each rule in my app is a different way of colouring.</w:t>
       </w:r>
     </w:p>
     <w:p>
@@ -872,7 +1030,7 @@
           <w:rFonts w:ascii="Georgia" w:hAnsi="Georgia"/>
           <w:sz w:val="26"/>
         </w:rPr>
-        <w:t>This theorem ties it together. The bookings fit in k berths exactly when no stretch has more than k people on it. One direction is pigeonhole. For the other, seat people in boarding order on the lowest free berth, and it never gets stuck. That's how the app proves an amber rejection: it builds a seating that fits everyone.</w:t>
+        <w:t>And one theorem ties it all together. The bookings fit in k berths if and only if no stretch of the route has more than k people. One direction is pigeonhole. For the other, seat people in the order they get on, each on the lowest free berth. That never gets stuck. And it is how the app proves an amber rejection: it actually builds a seating where everyone fits.</w:t>
       </w:r>
     </w:p>
     <w:p>
@@ -897,7 +1055,7 @@
           <w:rFonts w:ascii="Georgia" w:hAnsi="Georgia"/>
           <w:sz w:val="26"/>
         </w:rPr>
-        <w:t>I wrote it all in TypeScript, every algorithm from scratch. Mainly because the same code runs in the browser and on my laptop, so this demo uses the exact engine my experiments used. And strict types catch mistakes like mixing up a booking number with a berth number.</w:t>
+        <w:t>Quickly, about the language. I wrote everything in TypeScript, and every algorithm from scratch. The main reason: the same code runs in the browser and on my laptop. So this demo uses the exact engine from my experiments. TypeScript's strict types also catch silly mistakes, like mixing up a booking number and a berth number.</w:t>
       </w:r>
     </w:p>
     <w:p>
@@ -931,7 +1089,31 @@
         <w:pageBreakBefore/>
       </w:pPr>
       <w:r>
-        <w:t>The demo (2:50)</w:t>
+        <w:t>The demo (3:20)</w:t>
+      </w:r>
+    </w:p>
+    <w:p>
+      <w:r>
+        <w:rPr>
+          <w:i/>
+          <w:color w:val="4D4459"/>
+        </w:rPr>
+        <w:t xml:space="preserve">Each step below has a </w:t>
+      </w:r>
+      <w:r>
+        <w:rPr>
+          <w:b/>
+          <w:i/>
+          <w:color w:val="4D4459"/>
+        </w:rPr>
+        <w:t>Concept</w:t>
+      </w:r>
+      <w:r>
+        <w:rPr>
+          <w:i/>
+          <w:color w:val="4D4459"/>
+        </w:rPr>
+        <w:t xml:space="preserve"> line: the idea from slide 4 that the audience is looking at in that moment. Name it in one sentence, then move on. Slide 4 explained it; the demo shows it working.</w:t>
       </w:r>
     </w:p>
     <w:p>
@@ -983,7 +1165,7 @@
           <w:rFonts w:ascii="Georgia" w:hAnsi="Georgia"/>
           <w:sz w:val="26"/>
         </w:rPr>
-        <w:t>This is one sleeper coach of the Punjab Mail, Mumbai to Firozpur, 54 stops. Each row is a berth, 72 of them. Each column is the stretch between two stations. A green bar will be one passenger's trip.</w:t>
+        <w:t>This is one sleeper coach of the Punjab Mail, from Mumbai to Firozpur, with 54 stops. Each row is a berth, and there are 72 of them. Each column is the stretch between two stations. Each green bar will be one passenger's trip.</w:t>
       </w:r>
     </w:p>
     <w:p>
@@ -999,7 +1181,7 @@
           <w:rFonts w:ascii="Georgia" w:hAnsi="Georgia"/>
           <w:sz w:val="26"/>
         </w:rPr>
-        <w:t>On the left I've set up a busy day: 361 booking requests, about 1.4 times what this coach can hold.</w:t>
+        <w:t>I've set up a busy day: 361 booking requests. That's about 1.4 times what this coach can hold.</w:t>
       </w:r>
     </w:p>
     <w:p>
@@ -1014,7 +1196,61 @@
           <w:b w:val="0"/>
           <w:color w:val="5B35C8"/>
         </w:rPr>
-        <w:t xml:space="preserve">   0:30</w:t>
+        <w:t xml:space="preserve">   0:45</w:t>
+      </w:r>
+    </w:p>
+    <w:p>
+      <w:pPr>
+        <w:shd w:val="clear" w:color="auto" w:fill="FCEFD6"/>
+        <w:spacing w:before="120" w:after="80"/>
+        <w:ind w:left="113" w:right="113"/>
+      </w:pPr>
+      <w:r>
+        <w:rPr>
+          <w:b/>
+          <w:color w:val="8A5A00"/>
+          <w:sz w:val="19"/>
+        </w:rPr>
+        <w:t xml:space="preserve">CONCEPT  </w:t>
+      </w:r>
+      <w:r>
+        <w:rPr>
+          <w:b/>
+          <w:sz w:val="22"/>
+        </w:rPr>
+        <w:t>graph colouring</w:t>
+      </w:r>
+      <w:r>
+        <w:rPr>
+          <w:sz w:val="22"/>
+        </w:rPr>
+        <w:t xml:space="preserve"> and the </w:t>
+      </w:r>
+      <w:r>
+        <w:rPr>
+          <w:b/>
+          <w:sz w:val="22"/>
+        </w:rPr>
+        <w:t>overlap relation</w:t>
+      </w:r>
+      <w:r>
+        <w:rPr>
+          <w:sz w:val="22"/>
+        </w:rPr>
+        <w:t xml:space="preserve">, then </w:t>
+      </w:r>
+      <w:r>
+        <w:rPr>
+          <w:b/>
+          <w:sz w:val="22"/>
+        </w:rPr>
+        <w:t>chains</w:t>
+      </w:r>
+      <w:r>
+        <w:rPr>
+          <w:sz w:val="22"/>
+        </w:rPr>
+        <w:t>.</w:t>
       </w:r>
     </w:p>
     <w:p>
@@ -1048,7 +1284,7 @@
         <w:rPr>
           <w:sz w:val="22"/>
         </w:rPr>
-        <w:t>. Click it with the mouse, not the space bar. It takes about 10 to 15 seconds.</w:t>
+        <w:t>. Click it with the mouse, not the space bar. It takes about 10 to 15 seconds, so talk while it fills.</w:t>
       </w:r>
     </w:p>
     <w:p>
@@ -1064,7 +1300,7 @@
           <w:rFonts w:ascii="Georgia" w:hAnsi="Georgia"/>
           <w:sz w:val="26"/>
         </w:rPr>
-        <w:t>I'll start the bookings. The rule here is First-fit, the simplest colouring: each passenger gets the lowest-numbered berth that is free for their trip.</w:t>
+        <w:t>Let me start the bookings. The rule here is First-fit: each passenger gets the lowest-numbered berth that is free for their whole trip. In graph terms, that's greedy colouring. And the question "is this berth free?" is the overlap relation from the slide.</w:t>
       </w:r>
     </w:p>
     <w:p>
@@ -1073,7 +1309,7 @@
           <w:i/>
           <w:color w:val="4D4459"/>
         </w:rPr>
-        <w:t>When it stops, point at the counters along the top.</w:t>
+        <w:t>When it stops, point at any one row of the chart.</w:t>
       </w:r>
     </w:p>
     <w:p>
@@ -1089,7 +1325,16 @@
           <w:rFonts w:ascii="Georgia" w:hAnsi="Georgia"/>
           <w:sz w:val="26"/>
         </w:rPr>
-        <w:t>271 people got a berth, and 90 were waitlisted.</w:t>
+        <w:t>Look at any one row. The bars never overlap: each trip ends before the next one starts. So every row is a chain.</w:t>
+      </w:r>
+    </w:p>
+    <w:p>
+      <w:r>
+        <w:rPr>
+          <w:i/>
+          <w:color w:val="4D4459"/>
+        </w:rPr>
+        <w:t>Point at the counters along the top.</w:t>
       </w:r>
     </w:p>
     <w:p>
@@ -1105,7 +1350,23 @@
           <w:rFonts w:ascii="Georgia" w:hAnsi="Georgia"/>
           <w:sz w:val="26"/>
         </w:rPr>
-        <w:t>Now the important part. "Full here", the red one, is zero. "Fragmented", the amber one, is 90. So not one of those 90 people was turned away because the train was full.</w:t>
+        <w:t>271 people got a berth, and 90 were waitlisted.</w:t>
+      </w:r>
+    </w:p>
+    <w:p>
+      <w:pPr>
+        <w:pBdr>
+          <w:left w:val="single" w:sz="18" w:space="10" w:color="5B35C8"/>
+        </w:pBdr>
+        <w:spacing w:after="180" w:line="324" w:lineRule="auto"/>
+        <w:ind w:left="283"/>
+      </w:pPr>
+      <w:r>
+        <w:rPr>
+          <w:rFonts w:ascii="Georgia" w:hAnsi="Georgia"/>
+          <w:sz w:val="26"/>
+        </w:rPr>
+        <w:t>Now look at these two numbers. "Full here", in red, is zero. "Fragmented", in amber, is 90. So not one of these 90 people was turned away because the train was full.</w:t>
       </w:r>
     </w:p>
     <w:p>
@@ -1120,7 +1381,48 @@
           <w:b w:val="0"/>
           <w:color w:val="5B35C8"/>
         </w:rPr>
-        <w:t xml:space="preserve">   0:30</w:t>
+        <w:t xml:space="preserve">   0:40</w:t>
+      </w:r>
+    </w:p>
+    <w:p>
+      <w:pPr>
+        <w:shd w:val="clear" w:color="auto" w:fill="FCEFD6"/>
+        <w:spacing w:before="120" w:after="80"/>
+        <w:ind w:left="113" w:right="113"/>
+      </w:pPr>
+      <w:r>
+        <w:rPr>
+          <w:b/>
+          <w:color w:val="8A5A00"/>
+          <w:sz w:val="19"/>
+        </w:rPr>
+        <w:t xml:space="preserve">CONCEPT  </w:t>
+      </w:r>
+      <w:r>
+        <w:rPr>
+          <w:b/>
+          <w:sz w:val="22"/>
+        </w:rPr>
+        <w:t>the theorem</w:t>
+      </w:r>
+      <w:r>
+        <w:rPr>
+          <w:sz w:val="22"/>
+        </w:rPr>
+        <w:t xml:space="preserve">, and a </w:t>
+      </w:r>
+      <w:r>
+        <w:rPr>
+          <w:b/>
+          <w:sz w:val="22"/>
+        </w:rPr>
+        <w:t>constructive proof</w:t>
+      </w:r>
+      <w:r>
+        <w:rPr>
+          <w:sz w:val="22"/>
+        </w:rPr>
+        <w:t>.</w:t>
       </w:r>
     </w:p>
     <w:p>
@@ -1183,7 +1485,7 @@
           <w:rFonts w:ascii="Georgia" w:hAnsi="Georgia"/>
           <w:sz w:val="26"/>
         </w:rPr>
-        <w:t>Let's take one of them, passenger 207, Mumbai to Lalitpur. The app says every stretch of that trip still had a free berth. Even the busiest stretch had only 69 of 72 taken.</w:t>
+        <w:t>Let's pick one of them: passenger 207, from Mumbai to Lalitpur. The app says every stretch of this trip still had a free berth. The busiest stretch had 69 of the 72 berths taken. 69 is less than 72, so the theorem says a seating that includes this person must exist.</w:t>
       </w:r>
     </w:p>
     <w:p>
@@ -1233,7 +1535,7 @@
           <w:rFonts w:ascii="Georgia" w:hAnsi="Georgia"/>
           <w:sz w:val="26"/>
         </w:rPr>
-        <w:t>And here's the proof. This is an actual seating where everyone booked so far fits, including passenger 207, that amber bar. That's the theorem from the slide, built for this one passenger.</w:t>
+        <w:t>And here it is. The app builds it with the method from the proof. Seat everyone in the order they get on, each on the lowest free berth. The amber bar is passenger 207. So the app doesn't just say a seating exists. It shows you one.</w:t>
       </w:r>
     </w:p>
     <w:p>
@@ -1248,7 +1550,61 @@
           <w:b w:val="0"/>
           <w:color w:val="5B35C8"/>
         </w:rPr>
-        <w:t xml:space="preserve">   0:30</w:t>
+        <w:t xml:space="preserve">   0:40</w:t>
+      </w:r>
+    </w:p>
+    <w:p>
+      <w:pPr>
+        <w:shd w:val="clear" w:color="auto" w:fill="FCEFD6"/>
+        <w:spacing w:before="120" w:after="80"/>
+        <w:ind w:left="113" w:right="113"/>
+      </w:pPr>
+      <w:r>
+        <w:rPr>
+          <w:b/>
+          <w:color w:val="8A5A00"/>
+          <w:sz w:val="19"/>
+        </w:rPr>
+        <w:t xml:space="preserve">CONCEPT  </w:t>
+      </w:r>
+      <w:r>
+        <w:rPr>
+          <w:b/>
+          <w:sz w:val="22"/>
+        </w:rPr>
+        <w:t>functions</w:t>
+      </w:r>
+      <w:r>
+        <w:rPr>
+          <w:sz w:val="22"/>
+        </w:rPr>
+        <w:t xml:space="preserve">, and a </w:t>
+      </w:r>
+      <w:r>
+        <w:rPr>
+          <w:b/>
+          <w:sz w:val="22"/>
+        </w:rPr>
+        <w:t>greedy algorithm</w:t>
+      </w:r>
+      <w:r>
+        <w:rPr>
+          <w:sz w:val="22"/>
+        </w:rPr>
+        <w:t xml:space="preserve"> proved optimal by an </w:t>
+      </w:r>
+      <w:r>
+        <w:rPr>
+          <w:b/>
+          <w:sz w:val="22"/>
+        </w:rPr>
+        <w:t>exchange argument</w:t>
+      </w:r>
+      <w:r>
+        <w:rPr>
+          <w:sz w:val="22"/>
+        </w:rPr>
+        <w:t xml:space="preserve"> (the swapping argument).</w:t>
       </w:r>
     </w:p>
     <w:p>
@@ -1298,7 +1654,7 @@
           <w:rFonts w:ascii="Georgia" w:hAnsi="Georgia"/>
           <w:sz w:val="26"/>
         </w:rPr>
-        <w:t>Proving it one passenger at a time doesn't help anyone travel. So once booking closes, the app re-charts the coach. Everyone who has a berth keeps one, though some move, and it fits in as many waitlisted people as possible.</w:t>
+        <w:t>But proving it for one person doesn't help anyone travel. So when booking closes, the app re-charts the coach. Remember, a seating is a function from passengers to berths. Re-charting picks a better one. Everyone who had a berth keeps one, maybe a different one. And as many waitlisted people as possible are added.</w:t>
       </w:r>
     </w:p>
     <w:p>
@@ -1314,7 +1670,23 @@
           <w:rFonts w:ascii="Georgia" w:hAnsi="Georgia"/>
           <w:sz w:val="26"/>
         </w:rPr>
-        <w:t>Six of the 90 get a berth: the amber bars, and the green ticks in the waitlist. Passenger 207 is one of them. So 271 becomes 277, and six is provably the most you can add without cancelling anyone's ticket.</w:t>
+        <w:t>Six of the 90 now get a berth. They are the amber bars on the chart, and the green ticks in the list. Passenger 207 is one of them. So 271 becomes 277.</w:t>
+      </w:r>
+    </w:p>
+    <w:p>
+      <w:pPr>
+        <w:pBdr>
+          <w:left w:val="single" w:sz="18" w:space="10" w:color="5B35C8"/>
+        </w:pBdr>
+        <w:spacing w:after="180" w:line="324" w:lineRule="auto"/>
+        <w:ind w:left="283"/>
+      </w:pPr>
+      <w:r>
+        <w:rPr>
+          <w:rFonts w:ascii="Georgia" w:hAnsi="Georgia"/>
+          <w:sz w:val="26"/>
+        </w:rPr>
+        <w:t>And six is the most anyone could add. The method is simple: go through the waitlist in order of where each person gets off, and add anyone who still fits. A swapping argument proves nothing does better, and my tests check it against trying every possibility.</w:t>
       </w:r>
     </w:p>
     <w:p>
@@ -1329,7 +1701,35 @@
           <w:b w:val="0"/>
           <w:color w:val="5B35C8"/>
         </w:rPr>
-        <w:t xml:space="preserve">   0:30</w:t>
+        <w:t xml:space="preserve">   0:40</w:t>
+      </w:r>
+    </w:p>
+    <w:p>
+      <w:pPr>
+        <w:shd w:val="clear" w:color="auto" w:fill="FCEFD6"/>
+        <w:spacing w:before="120" w:after="80"/>
+        <w:ind w:left="113" w:right="113"/>
+      </w:pPr>
+      <w:r>
+        <w:rPr>
+          <w:b/>
+          <w:color w:val="8A5A00"/>
+          <w:sz w:val="19"/>
+        </w:rPr>
+        <w:t xml:space="preserve">CONCEPT  </w:t>
+      </w:r>
+      <w:r>
+        <w:rPr>
+          <w:b/>
+          <w:sz w:val="22"/>
+        </w:rPr>
+        <w:t>the theorem</w:t>
+      </w:r>
+      <w:r>
+        <w:rPr>
+          <w:sz w:val="22"/>
+        </w:rPr>
+        <w:t xml:space="preserve"> again, as the limit on what any rule can do.</w:t>
       </w:r>
     </w:p>
     <w:p>
@@ -1379,7 +1779,7 @@
           <w:rFonts w:ascii="Georgia" w:hAnsi="Georgia"/>
           <w:sz w:val="26"/>
         </w:rPr>
-        <w:t>If 90 were fragmented, why only six? Because each of them had room at the moment they asked, but people kept booking after them and used that room.</w:t>
+        <w:t>If 90 people were fragmented, why can only six get in? Because each of them had space at the moment they booked. But more people kept booking after them, and those people took the space.</w:t>
       </w:r>
     </w:p>
     <w:p>
@@ -1395,7 +1795,7 @@
           <w:rFonts w:ascii="Georgia" w:hAnsi="Georgia"/>
           <w:sz w:val="26"/>
         </w:rPr>
-        <w:t>This runs other rules on the same 361 people. Deciding berths only at charting, Deferred, gets 272. The best possible, if you knew every request in advance, is 301. But that would mean refusing people who booked early, and you can't know the future.</w:t>
+        <w:t>This table runs other rules on the same 361 people. Deferred, which gives out berth numbers only at charting time, seats 272. The best possible is 301. That's the biggest group whose busiest stretch stays within 72, and by the theorem it's the most that can fit. But to get there, you would need to know every booking in advance, and refuse some people who booked early.</w:t>
       </w:r>
     </w:p>
     <w:p>
@@ -1447,7 +1847,7 @@
           <w:rFonts w:ascii="Georgia" w:hAnsi="Georgia"/>
           <w:sz w:val="26"/>
         </w:rPr>
-        <w:t>So, to answer the question: when you're waitlisted, often the train isn't actually full, and this app can prove it passenger by passenger. Fixing the allocation wins back a few seats. The bigger loss is that we serve people first come, first served without knowing who comes next.</w:t>
+        <w:t>So, to answer my question: when you are waitlisted, often the train isn't really full. And this app can prove it, one passenger at a time. Better berth allocation wins back a few seats. The bigger loss is that we serve people first come, first served, without knowing who will book next.</w:t>
       </w:r>
     </w:p>
     <w:p>
@@ -1463,7 +1863,7 @@
           <w:rFonts w:ascii="Georgia" w:hAnsi="Georgia"/>
           <w:sz w:val="26"/>
         </w:rPr>
-        <w:t>Thank you. Happy to take questions, or to run any train you like.</w:t>
+        <w:t>Thank you. I'm happy to take questions, or to run any train you like.</w:t>
       </w:r>
     </w:p>
     <w:p>
@@ -1471,7 +1871,7 @@
         <w:pStyle w:val="Heading2"/>
       </w:pPr>
       <w:r>
-        <w:t>If the demo breaks</w:t>
+        <w:t>Extra, if asked about pigeonhole or Dilworth</w:t>
       </w:r>
     </w:p>
     <w:p>
@@ -1480,7 +1880,22 @@
           <w:i/>
           <w:color w:val="4D4459"/>
         </w:rPr>
-        <w:t xml:space="preserve">Reload the page, set Route and Demand again, press </w:t>
+        <w:t xml:space="preserve">Pigeonhole: under Allocation policy click </w:t>
+      </w:r>
+      <w:r>
+        <w:rPr>
+          <w:b/>
+          <w:i/>
+          <w:color w:val="4D4459"/>
+        </w:rPr>
+        <w:t>Deferred</w:t>
+      </w:r>
+      <w:r>
+        <w:rPr>
+          <w:i/>
+          <w:color w:val="4D4459"/>
+        </w:rPr>
+        <w:t xml:space="preserve">, click </w:t>
       </w:r>
       <w:r>
         <w:rPr>
@@ -1495,6 +1910,124 @@
           <w:i/>
           <w:color w:val="4D4459"/>
         </w:rPr>
+        <w:t xml:space="preserve">, then click the first red number, </w:t>
+      </w:r>
+      <w:r>
+        <w:rPr>
+          <w:b/>
+          <w:i/>
+          <w:color w:val="4D4459"/>
+        </w:rPr>
+        <w:t>#196</w:t>
+      </w:r>
+      <w:r>
+        <w:rPr>
+          <w:i/>
+          <w:color w:val="4D4459"/>
+        </w:rPr>
+        <w:t>.</w:t>
+      </w:r>
+    </w:p>
+    <w:p>
+      <w:pPr>
+        <w:pBdr>
+          <w:left w:val="single" w:sz="18" w:space="10" w:color="5B35C8"/>
+        </w:pBdr>
+        <w:spacing w:after="180" w:line="324" w:lineRule="auto"/>
+        <w:ind w:left="283"/>
+      </w:pPr>
+      <w:r>
+        <w:rPr>
+          <w:rFonts w:ascii="Georgia" w:hAnsi="Georgia"/>
+          <w:sz w:val="26"/>
+        </w:rPr>
+        <w:t>These red ones are the other kind. On one stretch of this trip, all 72 berths were already taken, and the app lists those 72 people. So a 73rd person can't fit. That's pigeonhole.</w:t>
+      </w:r>
+    </w:p>
+    <w:p>
+      <w:r>
+        <w:rPr>
+          <w:i/>
+          <w:color w:val="4D4459"/>
+        </w:rPr>
+        <w:t xml:space="preserve">Dilworth: click </w:t>
+      </w:r>
+      <w:r>
+        <w:rPr>
+          <w:b/>
+          <w:i/>
+          <w:color w:val="4D4459"/>
+        </w:rPr>
+        <w:t>Show all options</w:t>
+      </w:r>
+      <w:r>
+        <w:rPr>
+          <w:i/>
+          <w:color w:val="4D4459"/>
+        </w:rPr>
+        <w:t xml:space="preserve"> and point at </w:t>
+      </w:r>
+      <w:r>
+        <w:rPr>
+          <w:b/>
+          <w:i/>
+          <w:color w:val="4D4459"/>
+        </w:rPr>
+        <w:t>With unlimited berths</w:t>
+      </w:r>
+      <w:r>
+        <w:rPr>
+          <w:i/>
+          <w:color w:val="4D4459"/>
+        </w:rPr>
+        <w:t>, at the bottom right.</w:t>
+      </w:r>
+    </w:p>
+    <w:p>
+      <w:pPr>
+        <w:pBdr>
+          <w:left w:val="single" w:sz="18" w:space="10" w:color="5B35C8"/>
+        </w:pBdr>
+        <w:spacing w:after="180" w:line="324" w:lineRule="auto"/>
+        <w:ind w:left="283"/>
+      </w:pPr>
+      <w:r>
+        <w:rPr>
+          <w:rFonts w:ascii="Georgia" w:hAnsi="Georgia"/>
+          <w:sz w:val="26"/>
+        </w:rPr>
+        <w:t>To seat all 361 people, you would need at least 132 berths, because 132 people are on the busiest stretch. That's Dilworth's theorem: the fewest berths you need equals the biggest group of trips that all overlap. First-fit would use 138.</w:t>
+      </w:r>
+    </w:p>
+    <w:p>
+      <w:pPr>
+        <w:pStyle w:val="Heading2"/>
+      </w:pPr>
+      <w:r>
+        <w:t>If the demo breaks</w:t>
+      </w:r>
+    </w:p>
+    <w:p>
+      <w:r>
+        <w:rPr>
+          <w:i/>
+          <w:color w:val="4D4459"/>
+        </w:rPr>
+        <w:t xml:space="preserve">Reload the page, set Route and Demand again, press </w:t>
+      </w:r>
+      <w:r>
+        <w:rPr>
+          <w:b/>
+          <w:i/>
+          <w:color w:val="4D4459"/>
+        </w:rPr>
+        <w:t>End</w:t>
+      </w:r>
+      <w:r>
+        <w:rPr>
+          <w:i/>
+          <w:color w:val="4D4459"/>
+        </w:rPr>
         <w:t>, and carry on from step 3. The numbers will be the same.</w:t>
       </w:r>
     </w:p>
@@ -2145,6 +2678,137 @@
           <w:sz w:val="23"/>
         </w:rPr>
         <w:t>a proof for each rejected passenger, on real Indian routes, that anyone can open and check.</w:t>
+      </w:r>
+    </w:p>
+    <w:p>
+      <w:pPr>
+        <w:pStyle w:val="Heading2"/>
+      </w:pPr>
+      <w:r>
+        <w:t>The news on slide 2: sources</w:t>
+      </w:r>
+    </w:p>
+    <w:p>
+      <w:pPr>
+        <w:keepNext/>
+        <w:spacing w:after="40"/>
+      </w:pPr>
+      <w:r>
+        <w:rPr>
+          <w:b/>
+          <w:sz w:val="23"/>
+        </w:rPr>
+        <w:t>3.39 crore passengers:</w:t>
+      </w:r>
+    </w:p>
+    <w:p>
+      <w:pPr>
+        <w:spacing w:after="240"/>
+      </w:pPr>
+      <w:r>
+        <w:rPr>
+          <w:sz w:val="23"/>
+        </w:rPr>
+        <w:t xml:space="preserve">Angel One, 14 May 2026, reporting RTI data for 2025–26 (about 92,877 a day, up from 1.65 crore in 2021–22). </w:t>
+      </w:r>
+      <w:hyperlink r:id="rId12">
+        <w:r>
+          <w:rPr>
+            <w:color w:val="5B35C8"/>
+            <w:u w:val="single"/>
+          </w:rPr>
+          <w:t>https://www.angelone.in/news/economy/over-3-39-crore-indians-lost-train-journeys-in-fy26-as-waitlists-tatkal-rush-and-bots-overwhelm-railways</w:t>
+        </w:r>
+      </w:hyperlink>
+    </w:p>
+    <w:p>
+      <w:pPr>
+        <w:keepNext/>
+        <w:spacing w:after="40"/>
+      </w:pPr>
+      <w:r>
+        <w:rPr>
+          <w:b/>
+          <w:sz w:val="23"/>
+        </w:rPr>
+        <w:t>7,000 vacant berths a day:</w:t>
+      </w:r>
+    </w:p>
+    <w:p>
+      <w:pPr>
+        <w:spacing w:after="240"/>
+      </w:pPr>
+      <w:r>
+        <w:rPr>
+          <w:sz w:val="23"/>
+        </w:rPr>
+        <w:t xml:space="preserve">The Tribune (PTI), 18 Sep 2022, on ticket examiners' handheld terminals: in their first four months, about 7,000 vacant berths a day released, and 2,759 waitlisted and 5,448 RAC passengers a day given berths on board, across about 1,390 trains. </w:t>
+      </w:r>
+      <w:hyperlink r:id="rId13">
+        <w:r>
+          <w:rPr>
+            <w:color w:val="5B35C8"/>
+            <w:u w:val="single"/>
+          </w:rPr>
+          <w:t>https://www.tribuneindia.com/news/nation/railways-new-device-checks-real-time-seat-availability-allots-7-000-unconfirmed-passengers-berths-daily-432983</w:t>
+        </w:r>
+      </w:hyperlink>
+    </w:p>
+    <w:p>
+      <w:pPr>
+        <w:keepNext/>
+        <w:spacing w:after="40"/>
+      </w:pPr>
+      <w:r>
+        <w:rPr>
+          <w:b/>
+          <w:sz w:val="23"/>
+        </w:rPr>
+        <w:t>Since 2016:</w:t>
+      </w:r>
+    </w:p>
+    <w:p>
+      <w:pPr>
+        <w:spacing w:after="240"/>
+      </w:pPr>
+      <w:r>
+        <w:rPr>
+          <w:sz w:val="23"/>
+        </w:rPr>
+        <w:t xml:space="preserve">The Tribune (PTI), 30 Sep 2016: berths still vacant at the starting station after the second chart are allotted automatically to waitlisted passengers at later stations. </w:t>
+      </w:r>
+      <w:hyperlink r:id="rId14">
+        <w:r>
+          <w:rPr>
+            <w:color w:val="5B35C8"/>
+            <w:u w:val="single"/>
+          </w:rPr>
+          <w:t>https://www.tribuneindia.com/news/archive/business/rlys-announces-facility-to-clear-wait-listed-passengers-302480</w:t>
+        </w:r>
+      </w:hyperlink>
+    </w:p>
+    <w:p>
+      <w:pPr>
+        <w:keepNext/>
+        <w:spacing w:after="40"/>
+      </w:pPr>
+      <w:r>
+        <w:rPr>
+          <w:b/>
+          <w:sz w:val="23"/>
+        </w:rPr>
+        <w:t>Careful in answers:</w:t>
+      </w:r>
+    </w:p>
+    <w:p>
+      <w:pPr>
+        <w:spacing w:after="240"/>
+      </w:pPr>
+      <w:r>
+        <w:rPr>
+          <w:sz w:val="23"/>
+        </w:rPr>
+        <w:t>these empty berths come from no-shows, cancellations and quotas as well as allocation. The news shows the problem is real; it does not say how much of it is fragmentation. That is what the project measures.</w:t>
       </w:r>
     </w:p>
     <w:p>

</xml_diff>